<commit_message>
docs: update proposals, competitor research reports, legal references, and helper scripts
</commit_message>
<xml_diff>
--- a/Docs/01.Ban_HCM_Van_ban_de_xuat (1).docx
+++ b/Docs/01.Ban_HCM_Van_ban_de_xuat (1).docx
@@ -12696,136 +12696,6 @@
         </w:rPr>
       </w:pPr>
     </w:p>
-    <w:tbl>
-      <w:tblPr>
-        <w:tblStyle w:val="36"/>
-        <w:tblW w:w="11092" w:type="dxa"/>
-        <w:tblInd w:w="-635" w:type="dxa"/>
-        <w:tblBorders>
-          <w:top w:val="none" w:color="auto" w:sz="0" w:space="0"/>
-          <w:left w:val="none" w:color="auto" w:sz="0" w:space="0"/>
-          <w:bottom w:val="none" w:color="auto" w:sz="0" w:space="0"/>
-          <w:right w:val="none" w:color="auto" w:sz="0" w:space="0"/>
-          <w:insideH w:val="none" w:color="auto" w:sz="0" w:space="0"/>
-          <w:insideV w:val="none" w:color="auto" w:sz="0" w:space="0"/>
-        </w:tblBorders>
-        <w:tblLayout w:type="autofit"/>
-        <w:tblCellMar>
-          <w:top w:w="0" w:type="dxa"/>
-          <w:left w:w="108" w:type="dxa"/>
-          <w:bottom w:w="0" w:type="dxa"/>
-          <w:right w:w="108" w:type="dxa"/>
-        </w:tblCellMar>
-      </w:tblPr>
-      <w:tblGrid>
-        <w:gridCol w:w="4685"/>
-        <w:gridCol w:w="6407"/>
-      </w:tblGrid>
-      <w:tr>
-        <w:tblPrEx>
-          <w:tblBorders>
-            <w:top w:val="none" w:color="auto" w:sz="0" w:space="0"/>
-            <w:left w:val="none" w:color="auto" w:sz="0" w:space="0"/>
-            <w:bottom w:val="none" w:color="auto" w:sz="0" w:space="0"/>
-            <w:right w:val="none" w:color="auto" w:sz="0" w:space="0"/>
-            <w:insideH w:val="none" w:color="auto" w:sz="0" w:space="0"/>
-            <w:insideV w:val="none" w:color="auto" w:sz="0" w:space="0"/>
-          </w:tblBorders>
-          <w:tblCellMar>
-            <w:top w:w="0" w:type="dxa"/>
-            <w:left w:w="108" w:type="dxa"/>
-            <w:bottom w:w="0" w:type="dxa"/>
-            <w:right w:w="108" w:type="dxa"/>
-          </w:tblCellMar>
-        </w:tblPrEx>
-        <w:tc>
-          <w:tcPr>
-            <w:tcW w:w="4685" w:type="dxa"/>
-          </w:tcPr>
-          <w:p>
-            <w:pPr>
-              <w:spacing w:after="0" w:line="240" w:lineRule="auto"/>
-              <w:jc w:val="center"/>
-              <w:rPr>
-                <w:i/>
-                <w:iCs/>
-                <w:color w:val="auto"/>
-                <w:szCs w:val="26"/>
-                <w:lang w:val="vi-VN"/>
-              </w:rPr>
-            </w:pPr>
-            <w:bookmarkStart w:id="0" w:name="_GoBack"/>
-            <w:bookmarkEnd w:id="0"/>
-          </w:p>
-        </w:tc>
-        <w:tc>
-          <w:tcPr>
-            <w:tcW w:w="6407" w:type="dxa"/>
-          </w:tcPr>
-          <w:p>
-            <w:pPr>
-              <w:spacing w:after="0" w:line="240" w:lineRule="auto"/>
-              <w:jc w:val="center"/>
-              <w:rPr>
-                <w:rFonts w:hint="default"/>
-                <w:b/>
-                <w:bCs/>
-                <w:color w:val="auto"/>
-                <w:szCs w:val="26"/>
-                <w:lang w:val="en-US"/>
-              </w:rPr>
-            </w:pPr>
-            <w:r>
-              <w:rPr>
-                <w:rFonts w:hint="default"/>
-                <w:b/>
-                <w:bCs/>
-                <w:color w:val="auto"/>
-                <w:szCs w:val="26"/>
-                <w:lang w:val="en-US"/>
-              </w:rPr>
-              <w:t>CÔNG TY CỔ PHẦN CÔNG NGHỆ</w:t>
-            </w:r>
-          </w:p>
-          <w:p>
-            <w:pPr>
-              <w:spacing w:after="0" w:line="240" w:lineRule="auto"/>
-              <w:jc w:val="center"/>
-              <w:rPr>
-                <w:rFonts w:hint="default"/>
-                <w:b/>
-                <w:bCs/>
-                <w:color w:val="auto"/>
-                <w:szCs w:val="26"/>
-                <w:lang w:val="en-US"/>
-              </w:rPr>
-            </w:pPr>
-            <w:r>
-              <w:rPr>
-                <w:rFonts w:hint="default"/>
-                <w:b/>
-                <w:bCs/>
-                <w:color w:val="auto"/>
-                <w:szCs w:val="26"/>
-                <w:lang w:val="en-US"/>
-              </w:rPr>
-              <w:t>VÀ TƯ VẤN CIC</w:t>
-            </w:r>
-          </w:p>
-          <w:p>
-            <w:pPr>
-              <w:spacing w:after="0" w:line="240" w:lineRule="auto"/>
-              <w:jc w:val="center"/>
-              <w:rPr>
-                <w:color w:val="auto"/>
-                <w:szCs w:val="26"/>
-                <w:lang w:val="pt-BR"/>
-              </w:rPr>
-            </w:pPr>
-          </w:p>
-        </w:tc>
-      </w:tr>
-    </w:tbl>
     <w:p>
       <w:pPr>
         <w:rPr>
@@ -12842,6 +12712,3265 @@
         </w:rPr>
       </w:pPr>
     </w:p>
+    <w:p>
+      <w:pPr>
+        <w:spacing w:before="240" w:after="240" w:lineRule="auto" w:line="276"/>
+        <w:jc w:val="both"/>
+      </w:pPr>
+    </w:p>
+    <w:p>
+      <w:pPr>
+        <w:spacing w:before="280" w:after="80" w:lineRule="auto" w:line="276"/>
+        <w:jc w:val="left"/>
+      </w:pPr>
+      <w:r>
+        <w:rPr>
+          <w:rFonts w:ascii="Times New Roman" w:hAnsi="Times New Roman" w:cs="Times New Roman" w:eastAsia="Times New Roman"/>
+          <w:b/>
+          <w:i w:val="0"/>
+          <w:sz w:val="26"/>
+        </w:rPr>
+        <w:t>V. ĐỀ XUẤT NỀN TẢNG MÔI TRƯỜNG DỮ LIỆU CHUNG (CDE) CỦA CIC — ĐÁP ỨNG QCVN 12:2026/BCA</w:t>
+      </w:r>
+    </w:p>
+    <w:p>
+      <w:pPr>
+        <w:spacing w:before="200" w:after="60" w:lineRule="auto" w:line="276"/>
+        <w:jc w:val="left"/>
+      </w:pPr>
+      <w:r>
+        <w:rPr>
+          <w:rFonts w:ascii="Times New Roman" w:hAnsi="Times New Roman" w:cs="Times New Roman" w:eastAsia="Times New Roman"/>
+          <w:b/>
+          <w:i w:val="0"/>
+          <w:sz w:val="26"/>
+        </w:rPr>
+        <w:t>1. Sự cần thiết của nền tảng CDE nội địa</w:t>
+      </w:r>
+    </w:p>
+    <w:p>
+      <w:pPr>
+        <w:spacing w:before="40" w:after="40" w:lineRule="auto" w:line="276"/>
+        <w:ind w:firstLine="720"/>
+        <w:jc w:val="both"/>
+      </w:pPr>
+      <w:r>
+        <w:rPr>
+          <w:rFonts w:ascii="Times New Roman" w:hAnsi="Times New Roman" w:cs="Times New Roman" w:eastAsia="Times New Roman"/>
+          <w:b w:val="0"/>
+          <w:i w:val="0"/>
+          <w:sz w:val="26"/>
+        </w:rPr>
+        <w:t>Kể từ ngày 01/07/2026, hai quy định pháp lý quan trọng đồng thời có hiệu lực tạo ra yêu cầu bắt buộc đối với Ban:</w:t>
+      </w:r>
+    </w:p>
+    <w:p>
+      <w:pPr>
+        <w:spacing w:before="20" w:after="20"/>
+        <w:ind w:left="360"/>
+        <w:jc w:val="both"/>
+      </w:pPr>
+      <w:r>
+        <w:rPr>
+          <w:rFonts w:ascii="Times New Roman" w:hAnsi="Times New Roman" w:cs="Times New Roman" w:eastAsia="Times New Roman"/>
+          <w:b/>
+          <w:i w:val="0"/>
+          <w:sz w:val="26"/>
+        </w:rPr>
+        <w:t xml:space="preserve">• **Nghị định về Quản lý Hoạt động Xây dựng** </w:t>
+      </w:r>
+      <w:r>
+        <w:rPr>
+          <w:rFonts w:ascii="Times New Roman" w:hAnsi="Times New Roman" w:cs="Times New Roman" w:eastAsia="Times New Roman"/>
+          <w:b w:val="0"/>
+          <w:i w:val="0"/>
+          <w:sz w:val="26"/>
+        </w:rPr>
+        <w:t xml:space="preserve">(hiệu lực 01/07/2026): Quy định Chủ đầu tư có trách nhiệm tổ chức quản lý và lưu trữ định dạng dữ liệu gốc của mô hình BIM trên </w:t>
+      </w:r>
+      <w:r>
+        <w:rPr>
+          <w:rFonts w:ascii="Times New Roman" w:hAnsi="Times New Roman" w:cs="Times New Roman" w:eastAsia="Times New Roman"/>
+          <w:b/>
+          <w:i w:val="0"/>
+          <w:sz w:val="26"/>
+        </w:rPr>
+        <w:t>Môi trường dữ liệu chung (CDE)</w:t>
+      </w:r>
+      <w:r>
+        <w:rPr>
+          <w:rFonts w:ascii="Times New Roman" w:hAnsi="Times New Roman" w:cs="Times New Roman" w:eastAsia="Times New Roman"/>
+          <w:b w:val="0"/>
+          <w:i w:val="0"/>
+          <w:sz w:val="26"/>
+        </w:rPr>
+        <w:t xml:space="preserve"> bằng định dạng mở IFC 4.0+. Đây là lần đầu tiên thuật ngữ "CDE" và "IFC" được đưa vào yêu cầu quản lý nhà nước.</w:t>
+      </w:r>
+    </w:p>
+    <w:p>
+      <w:pPr>
+        <w:spacing w:before="20" w:after="20"/>
+        <w:ind w:left="360"/>
+        <w:jc w:val="both"/>
+      </w:pPr>
+      <w:r>
+        <w:rPr>
+          <w:rFonts w:ascii="Times New Roman" w:hAnsi="Times New Roman" w:cs="Times New Roman" w:eastAsia="Times New Roman"/>
+          <w:b/>
+          <w:i w:val="0"/>
+          <w:sz w:val="26"/>
+        </w:rPr>
+        <w:t xml:space="preserve">• **Thông tư số 47/2026/TT-BCA** </w:t>
+      </w:r>
+      <w:r>
+        <w:rPr>
+          <w:rFonts w:ascii="Times New Roman" w:hAnsi="Times New Roman" w:cs="Times New Roman" w:eastAsia="Times New Roman"/>
+          <w:b w:val="0"/>
+          <w:i w:val="0"/>
+          <w:sz w:val="26"/>
+        </w:rPr>
+        <w:t xml:space="preserve">(hiệu lực 01/07/2026): Ban hành </w:t>
+      </w:r>
+      <w:r>
+        <w:rPr>
+          <w:rFonts w:ascii="Times New Roman" w:hAnsi="Times New Roman" w:cs="Times New Roman" w:eastAsia="Times New Roman"/>
+          <w:b/>
+          <w:i w:val="0"/>
+          <w:sz w:val="26"/>
+        </w:rPr>
+        <w:t>QCVN 12:2026/BCA</w:t>
+      </w:r>
+      <w:r>
+        <w:rPr>
+          <w:rFonts w:ascii="Times New Roman" w:hAnsi="Times New Roman" w:cs="Times New Roman" w:eastAsia="Times New Roman"/>
+          <w:b w:val="0"/>
+          <w:i w:val="0"/>
+          <w:sz w:val="26"/>
+        </w:rPr>
+        <w:t xml:space="preserve"> — Quy chuẩn kỹ thuật quốc gia về an ninh mạng cho hệ thống thông tin lưu trữ tài liệu điện tử trong các cơ quan Đảng, Nhà nước. Quy chuẩn này bao gồm </w:t>
+      </w:r>
+      <w:r>
+        <w:rPr>
+          <w:rFonts w:ascii="Times New Roman" w:hAnsi="Times New Roman" w:cs="Times New Roman" w:eastAsia="Times New Roman"/>
+          <w:b/>
+          <w:i w:val="0"/>
+          <w:sz w:val="26"/>
+        </w:rPr>
+        <w:t>22 nhóm yêu cầu kỹ thuật</w:t>
+      </w:r>
+      <w:r>
+        <w:rPr>
+          <w:rFonts w:ascii="Times New Roman" w:hAnsi="Times New Roman" w:cs="Times New Roman" w:eastAsia="Times New Roman"/>
+          <w:b w:val="0"/>
+          <w:i w:val="0"/>
+          <w:sz w:val="26"/>
+        </w:rPr>
+        <w:t xml:space="preserve"> bắt buộc, trong đó có yêu cầu then chốt tại </w:t>
+      </w:r>
+      <w:r>
+        <w:rPr>
+          <w:rFonts w:ascii="Times New Roman" w:hAnsi="Times New Roman" w:cs="Times New Roman" w:eastAsia="Times New Roman"/>
+          <w:b/>
+          <w:i w:val="0"/>
+          <w:sz w:val="26"/>
+        </w:rPr>
+        <w:t>Điều 2.2.16.1.4</w:t>
+      </w:r>
+      <w:r>
+        <w:rPr>
+          <w:rFonts w:ascii="Times New Roman" w:hAnsi="Times New Roman" w:cs="Times New Roman" w:eastAsia="Times New Roman"/>
+          <w:b w:val="0"/>
+          <w:i w:val="0"/>
+          <w:sz w:val="26"/>
+        </w:rPr>
+        <w:t xml:space="preserve">: </w:t>
+      </w:r>
+      <w:r>
+        <w:rPr>
+          <w:rFonts w:ascii="Times New Roman" w:hAnsi="Times New Roman" w:cs="Times New Roman" w:eastAsia="Times New Roman"/>
+          <w:b w:val="0"/>
+          <w:i/>
+          <w:sz w:val="26"/>
+        </w:rPr>
+        <w:t>"Đối với nhà cung cấp dịch vụ lưu trữ, phải đặt hạ tầng vật lý hoặc trung tâm dữ liệu tại Việt Nam."</w:t>
+      </w:r>
+    </w:p>
+    <w:p>
+      <w:pPr>
+        <w:spacing w:before="40" w:after="40" w:lineRule="auto" w:line="276"/>
+        <w:ind w:firstLine="720"/>
+        <w:jc w:val="both"/>
+      </w:pPr>
+      <w:r>
+        <w:rPr>
+          <w:rFonts w:ascii="Times New Roman" w:hAnsi="Times New Roman" w:cs="Times New Roman" w:eastAsia="Times New Roman"/>
+          <w:b/>
+          <w:i w:val="0"/>
+          <w:sz w:val="26"/>
+        </w:rPr>
+        <w:t>Hệ quả trực tiếp:</w:t>
+      </w:r>
+      <w:r>
+        <w:rPr>
+          <w:rFonts w:ascii="Times New Roman" w:hAnsi="Times New Roman" w:cs="Times New Roman" w:eastAsia="Times New Roman"/>
+          <w:b w:val="0"/>
+          <w:i w:val="0"/>
+          <w:sz w:val="26"/>
+        </w:rPr>
+        <w:t xml:space="preserve"> Các nền tảng CDE nước ngoài (Autodesk Construction Cloud, Fomra Data Management, Trimble Connect, BIMPlus, BIMCollab) với máy chủ đặt ngoài lãnh thổ Việt Nam </w:t>
+      </w:r>
+      <w:r>
+        <w:rPr>
+          <w:rFonts w:ascii="Times New Roman" w:hAnsi="Times New Roman" w:cs="Times New Roman" w:eastAsia="Times New Roman"/>
+          <w:b/>
+          <w:i w:val="0"/>
+          <w:sz w:val="26"/>
+        </w:rPr>
+        <w:t>không đáp ứng được</w:t>
+      </w:r>
+      <w:r>
+        <w:rPr>
+          <w:rFonts w:ascii="Times New Roman" w:hAnsi="Times New Roman" w:cs="Times New Roman" w:eastAsia="Times New Roman"/>
+          <w:b w:val="0"/>
+          <w:i w:val="0"/>
+          <w:sz w:val="26"/>
+        </w:rPr>
+        <w:t xml:space="preserve"> yêu cầu bắt buộc của QCVN 12:2026/BCA đối với các dự án sử dụng vốn ngân sách nhà nước. Ban QLDA — với tư cách cơ quan nhà nước — buộc phải sử dụng nền tảng CDE tuân thủ đầy đủ 22 tiêu chí an ninh mạng.</w:t>
+      </w:r>
+    </w:p>
+    <w:p>
+      <w:pPr>
+        <w:spacing w:before="200" w:after="60" w:lineRule="auto" w:line="276"/>
+        <w:jc w:val="left"/>
+      </w:pPr>
+      <w:r>
+        <w:rPr>
+          <w:rFonts w:ascii="Times New Roman" w:hAnsi="Times New Roman" w:cs="Times New Roman" w:eastAsia="Times New Roman"/>
+          <w:b/>
+          <w:i w:val="0"/>
+          <w:sz w:val="26"/>
+        </w:rPr>
+        <w:t>2. Giới thiệu nền tảng CDE CIC</w:t>
+      </w:r>
+    </w:p>
+    <w:p>
+      <w:pPr>
+        <w:spacing w:before="40" w:after="40" w:lineRule="auto" w:line="276"/>
+        <w:ind w:firstLine="720"/>
+        <w:jc w:val="both"/>
+      </w:pPr>
+      <w:r>
+        <w:rPr>
+          <w:rFonts w:ascii="Times New Roman" w:hAnsi="Times New Roman" w:cs="Times New Roman" w:eastAsia="Times New Roman"/>
+          <w:b w:val="0"/>
+          <w:i w:val="0"/>
+          <w:sz w:val="26"/>
+        </w:rPr>
+        <w:t xml:space="preserve">Công ty Cổ phần Công nghệ và Tư vấn CIC (tiền thân Trung tâm Tin học — Bộ Xây dựng) đang phát triển nền tảng </w:t>
+      </w:r>
+      <w:r>
+        <w:rPr>
+          <w:rFonts w:ascii="Times New Roman" w:hAnsi="Times New Roman" w:cs="Times New Roman" w:eastAsia="Times New Roman"/>
+          <w:b/>
+          <w:i w:val="0"/>
+          <w:sz w:val="26"/>
+        </w:rPr>
+        <w:t>CDE CIC</w:t>
+      </w:r>
+      <w:r>
+        <w:rPr>
+          <w:rFonts w:ascii="Times New Roman" w:hAnsi="Times New Roman" w:cs="Times New Roman" w:eastAsia="Times New Roman"/>
+          <w:b w:val="0"/>
+          <w:i w:val="0"/>
+          <w:sz w:val="26"/>
+        </w:rPr>
+        <w:t xml:space="preserve"> — Môi trường Dữ liệu Chung BIM "Make in Vietnam" đầu tiên, được thiết kế từ đầu theo nguyên tắc </w:t>
+      </w:r>
+      <w:r>
+        <w:rPr>
+          <w:rFonts w:ascii="Times New Roman" w:hAnsi="Times New Roman" w:cs="Times New Roman" w:eastAsia="Times New Roman"/>
+          <w:b/>
+          <w:i w:val="0"/>
+          <w:sz w:val="26"/>
+        </w:rPr>
+        <w:t>Security by Design</w:t>
+      </w:r>
+      <w:r>
+        <w:rPr>
+          <w:rFonts w:ascii="Times New Roman" w:hAnsi="Times New Roman" w:cs="Times New Roman" w:eastAsia="Times New Roman"/>
+          <w:b w:val="0"/>
+          <w:i w:val="0"/>
+          <w:sz w:val="26"/>
+        </w:rPr>
+        <w:t xml:space="preserve"> (Bảo mật từ trong thiết kế) nhằm đáp ứng QCVN 12:2026/BCA.</w:t>
+      </w:r>
+    </w:p>
+    <w:p>
+      <w:pPr>
+        <w:spacing w:before="160" w:after="40" w:lineRule="auto" w:line="276"/>
+        <w:jc w:val="left"/>
+      </w:pPr>
+      <w:r>
+        <w:rPr>
+          <w:rFonts w:ascii="Times New Roman" w:hAnsi="Times New Roman" w:cs="Times New Roman" w:eastAsia="Times New Roman"/>
+          <w:b/>
+          <w:i/>
+          <w:sz w:val="26"/>
+        </w:rPr>
+        <w:t>Đặc điểm nổi bật:</w:t>
+      </w:r>
+    </w:p>
+    <w:p>
+      <w:pPr>
+        <w:spacing w:before="200" w:after="60" w:lineRule="auto" w:line="276"/>
+        <w:jc w:val="left"/>
+      </w:pPr>
+      <w:r>
+        <w:rPr>
+          <w:rFonts w:ascii="Times New Roman" w:hAnsi="Times New Roman" w:cs="Times New Roman" w:eastAsia="Times New Roman"/>
+          <w:b/>
+          <w:i w:val="0"/>
+          <w:sz w:val="26"/>
+        </w:rPr>
+        <w:t>3. Đề xuất Ban sử dụng CDE CIC — Phân hệ 1 + 2</w:t>
+      </w:r>
+    </w:p>
+    <w:tbl>
+      <w:tblPr>
+        <w:tblW w:type="auto" w:w="0"/>
+        <w:jc w:val="center"/>
+        <w:tblLayout w:type="autofit"/>
+        <w:tblLook w:firstColumn="1" w:firstRow="1" w:lastColumn="0" w:lastRow="0" w:noHBand="0" w:noVBand="1" w:val="04A0"/>
+        <w:tblBorders>
+          <w:top w:val="single" w:sz="4" w:space="0" w:color="000000"/>
+          <w:left w:val="single" w:sz="4" w:space="0" w:color="000000"/>
+          <w:bottom w:val="single" w:sz="4" w:space="0" w:color="000000"/>
+          <w:right w:val="single" w:sz="4" w:space="0" w:color="000000"/>
+          <w:insideH w:val="single" w:sz="4" w:space="0" w:color="000000"/>
+          <w:insideV w:val="single" w:sz="4" w:space="0" w:color="000000"/>
+        </w:tblBorders>
+      </w:tblPr>
+      <w:tblGrid>
+        <w:gridCol w:w="3120"/>
+        <w:gridCol w:w="3120"/>
+        <w:gridCol w:w="3120"/>
+      </w:tblGrid>
+      <w:tr>
+        <w:tc>
+          <w:tcPr>
+            <w:tcW w:type="dxa" w:w="3120"/>
+          </w:tcPr>
+          <w:p>
+            <w:pPr>
+              <w:spacing w:before="20" w:after="20" w:line="276" w:lineRule="auto"/>
+              <w:jc w:val="center"/>
+            </w:pPr>
+            <w:r>
+              <w:rPr>
+                <w:rFonts w:ascii="Times New Roman" w:hAnsi="Times New Roman" w:cs="Times New Roman" w:eastAsia="Times New Roman"/>
+                <w:b/>
+                <w:i w:val="0"/>
+                <w:sz w:val="22"/>
+              </w:rPr>
+              <w:t>Tiêu chí</w:t>
+            </w:r>
+          </w:p>
+        </w:tc>
+        <w:tc>
+          <w:tcPr>
+            <w:tcW w:type="dxa" w:w="3120"/>
+          </w:tcPr>
+          <w:p>
+            <w:pPr>
+              <w:spacing w:before="20" w:after="20" w:line="276" w:lineRule="auto"/>
+              <w:jc w:val="center"/>
+            </w:pPr>
+            <w:r>
+              <w:rPr>
+                <w:rFonts w:ascii="Times New Roman" w:hAnsi="Times New Roman" w:cs="Times New Roman" w:eastAsia="Times New Roman"/>
+                <w:b/>
+                <w:i w:val="0"/>
+                <w:sz w:val="22"/>
+              </w:rPr>
+              <w:t>CDE CIC</w:t>
+            </w:r>
+          </w:p>
+        </w:tc>
+        <w:tc>
+          <w:tcPr>
+            <w:tcW w:type="dxa" w:w="3120"/>
+          </w:tcPr>
+          <w:p>
+            <w:pPr>
+              <w:spacing w:before="20" w:after="20" w:line="276" w:lineRule="auto"/>
+              <w:jc w:val="center"/>
+            </w:pPr>
+            <w:r>
+              <w:rPr>
+                <w:rFonts w:ascii="Times New Roman" w:hAnsi="Times New Roman" w:cs="Times New Roman" w:eastAsia="Times New Roman"/>
+                <w:b/>
+                <w:i w:val="0"/>
+                <w:sz w:val="22"/>
+              </w:rPr>
+              <w:t>CDE nước ngoài (ACC, Trimble Connect, BIMPlus...)</w:t>
+            </w:r>
+          </w:p>
+        </w:tc>
+      </w:tr>
+      <w:tr>
+        <w:tc>
+          <w:tcPr>
+            <w:tcW w:type="dxa" w:w="3120"/>
+          </w:tcPr>
+          <w:p>
+            <w:pPr>
+              <w:spacing w:before="20" w:after="20" w:line="276" w:lineRule="auto"/>
+              <w:jc w:val="left"/>
+            </w:pPr>
+            <w:r>
+              <w:rPr>
+                <w:rFonts w:ascii="Times New Roman" w:hAnsi="Times New Roman" w:cs="Times New Roman" w:eastAsia="Times New Roman"/>
+                <w:b/>
+                <w:i w:val="0"/>
+                <w:sz w:val="22"/>
+              </w:rPr>
+              <w:t>Máy chủ đặt tại Việt Nam</w:t>
+            </w:r>
+            <w:r>
+              <w:rPr>
+                <w:rFonts w:ascii="Times New Roman" w:hAnsi="Times New Roman" w:cs="Times New Roman" w:eastAsia="Times New Roman"/>
+                <w:b w:val="0"/>
+                <w:i w:val="0"/>
+                <w:sz w:val="22"/>
+              </w:rPr>
+              <w:t xml:space="preserve"> (QCVN 12, Đ.2.2.16.1.4)</w:t>
+            </w:r>
+          </w:p>
+        </w:tc>
+        <w:tc>
+          <w:tcPr>
+            <w:tcW w:type="dxa" w:w="3120"/>
+          </w:tcPr>
+          <w:p>
+            <w:pPr>
+              <w:spacing w:before="20" w:after="20" w:line="276" w:lineRule="auto"/>
+              <w:jc w:val="left"/>
+            </w:pPr>
+            <w:r>
+              <w:rPr>
+                <w:rFonts w:ascii="Times New Roman" w:hAnsi="Times New Roman" w:cs="Times New Roman" w:eastAsia="Times New Roman"/>
+                <w:b w:val="0"/>
+                <w:i w:val="0"/>
+                <w:sz w:val="22"/>
+              </w:rPr>
+              <w:t>✅ Viettel Cloud / VNPT — Tier III</w:t>
+            </w:r>
+          </w:p>
+        </w:tc>
+        <w:tc>
+          <w:tcPr>
+            <w:tcW w:type="dxa" w:w="3120"/>
+          </w:tcPr>
+          <w:p>
+            <w:pPr>
+              <w:spacing w:before="20" w:after="20" w:line="276" w:lineRule="auto"/>
+              <w:jc w:val="left"/>
+            </w:pPr>
+            <w:r>
+              <w:rPr>
+                <w:rFonts w:ascii="Times New Roman" w:hAnsi="Times New Roman" w:cs="Times New Roman" w:eastAsia="Times New Roman"/>
+                <w:b w:val="0"/>
+                <w:i w:val="0"/>
+                <w:sz w:val="22"/>
+              </w:rPr>
+              <w:t>❌ Máy chủ nước ngoài</w:t>
+            </w:r>
+          </w:p>
+        </w:tc>
+      </w:tr>
+      <w:tr>
+        <w:tc>
+          <w:tcPr>
+            <w:tcW w:type="dxa" w:w="3120"/>
+          </w:tcPr>
+          <w:p>
+            <w:pPr>
+              <w:spacing w:before="20" w:after="20" w:line="276" w:lineRule="auto"/>
+              <w:jc w:val="left"/>
+            </w:pPr>
+            <w:r>
+              <w:rPr>
+                <w:rFonts w:ascii="Times New Roman" w:hAnsi="Times New Roman" w:cs="Times New Roman" w:eastAsia="Times New Roman"/>
+                <w:b/>
+                <w:i w:val="0"/>
+                <w:sz w:val="22"/>
+              </w:rPr>
+              <w:t>Tuân thủ 22 tiêu chí QCVN 12</w:t>
+            </w:r>
+          </w:p>
+        </w:tc>
+        <w:tc>
+          <w:tcPr>
+            <w:tcW w:type="dxa" w:w="3120"/>
+          </w:tcPr>
+          <w:p>
+            <w:pPr>
+              <w:spacing w:before="20" w:after="20" w:line="276" w:lineRule="auto"/>
+              <w:jc w:val="left"/>
+            </w:pPr>
+            <w:r>
+              <w:rPr>
+                <w:rFonts w:ascii="Times New Roman" w:hAnsi="Times New Roman" w:cs="Times New Roman" w:eastAsia="Times New Roman"/>
+                <w:b w:val="0"/>
+                <w:i w:val="0"/>
+                <w:sz w:val="22"/>
+              </w:rPr>
+              <w:t>✅ Thiết kế kiến trúc Security by Design</w:t>
+            </w:r>
+          </w:p>
+        </w:tc>
+        <w:tc>
+          <w:tcPr>
+            <w:tcW w:type="dxa" w:w="3120"/>
+          </w:tcPr>
+          <w:p>
+            <w:pPr>
+              <w:spacing w:before="20" w:after="20" w:line="276" w:lineRule="auto"/>
+              <w:jc w:val="left"/>
+            </w:pPr>
+            <w:r>
+              <w:rPr>
+                <w:rFonts w:ascii="Times New Roman" w:hAnsi="Times New Roman" w:cs="Times New Roman" w:eastAsia="Times New Roman"/>
+                <w:b w:val="0"/>
+                <w:i w:val="0"/>
+                <w:sz w:val="22"/>
+              </w:rPr>
+              <w:t>❌ Không điều chỉnh cho VN</w:t>
+            </w:r>
+          </w:p>
+        </w:tc>
+      </w:tr>
+      <w:tr>
+        <w:tc>
+          <w:tcPr>
+            <w:tcW w:type="dxa" w:w="3120"/>
+          </w:tcPr>
+          <w:p>
+            <w:pPr>
+              <w:spacing w:before="20" w:after="20" w:line="276" w:lineRule="auto"/>
+              <w:jc w:val="left"/>
+            </w:pPr>
+            <w:r>
+              <w:rPr>
+                <w:rFonts w:ascii="Times New Roman" w:hAnsi="Times New Roman" w:cs="Times New Roman" w:eastAsia="Times New Roman"/>
+                <w:b/>
+                <w:i w:val="0"/>
+                <w:sz w:val="22"/>
+              </w:rPr>
+              <w:t>Chuẩn ISO 19650</w:t>
+            </w:r>
+            <w:r>
+              <w:rPr>
+                <w:rFonts w:ascii="Times New Roman" w:hAnsi="Times New Roman" w:cs="Times New Roman" w:eastAsia="Times New Roman"/>
+                <w:b w:val="0"/>
+                <w:i w:val="0"/>
+                <w:sz w:val="22"/>
+              </w:rPr>
+              <w:t xml:space="preserve"> (4 vùng trạng thái: WIP → Shared → Published → Archive)</w:t>
+            </w:r>
+          </w:p>
+        </w:tc>
+        <w:tc>
+          <w:tcPr>
+            <w:tcW w:type="dxa" w:w="3120"/>
+          </w:tcPr>
+          <w:p>
+            <w:pPr>
+              <w:spacing w:before="20" w:after="20" w:line="276" w:lineRule="auto"/>
+              <w:jc w:val="left"/>
+            </w:pPr>
+            <w:r>
+              <w:rPr>
+                <w:rFonts w:ascii="Times New Roman" w:hAnsi="Times New Roman" w:cs="Times New Roman" w:eastAsia="Times New Roman"/>
+                <w:b w:val="0"/>
+                <w:i w:val="0"/>
+                <w:sz w:val="22"/>
+              </w:rPr>
+              <w:t>✅ Đầy đủ 4 vùng + 7 tiêu chí CDE</w:t>
+            </w:r>
+          </w:p>
+        </w:tc>
+        <w:tc>
+          <w:tcPr>
+            <w:tcW w:type="dxa" w:w="3120"/>
+          </w:tcPr>
+          <w:p>
+            <w:pPr>
+              <w:spacing w:before="20" w:after="20" w:line="276" w:lineRule="auto"/>
+              <w:jc w:val="left"/>
+            </w:pPr>
+            <w:r>
+              <w:rPr>
+                <w:rFonts w:ascii="Times New Roman" w:hAnsi="Times New Roman" w:cs="Times New Roman" w:eastAsia="Times New Roman"/>
+                <w:b w:val="0"/>
+                <w:i w:val="0"/>
+                <w:sz w:val="22"/>
+              </w:rPr>
+              <w:t>✅ Có (nhưng không bản địa hóa nghiệp vụ VN)</w:t>
+            </w:r>
+          </w:p>
+        </w:tc>
+      </w:tr>
+      <w:tr>
+        <w:tc>
+          <w:tcPr>
+            <w:tcW w:type="dxa" w:w="3120"/>
+          </w:tcPr>
+          <w:p>
+            <w:pPr>
+              <w:spacing w:before="20" w:after="20" w:line="276" w:lineRule="auto"/>
+              <w:jc w:val="left"/>
+            </w:pPr>
+            <w:r>
+              <w:rPr>
+                <w:rFonts w:ascii="Times New Roman" w:hAnsi="Times New Roman" w:cs="Times New Roman" w:eastAsia="Times New Roman"/>
+                <w:b/>
+                <w:i w:val="0"/>
+                <w:sz w:val="22"/>
+              </w:rPr>
+              <w:t>Định dạng mở IFC 4.0+</w:t>
+            </w:r>
+          </w:p>
+        </w:tc>
+        <w:tc>
+          <w:tcPr>
+            <w:tcW w:type="dxa" w:w="3120"/>
+          </w:tcPr>
+          <w:p>
+            <w:pPr>
+              <w:spacing w:before="20" w:after="20" w:line="276" w:lineRule="auto"/>
+              <w:jc w:val="left"/>
+            </w:pPr>
+            <w:r>
+              <w:rPr>
+                <w:rFonts w:ascii="Times New Roman" w:hAnsi="Times New Roman" w:cs="Times New Roman" w:eastAsia="Times New Roman"/>
+                <w:b w:val="0"/>
+                <w:i w:val="0"/>
+                <w:sz w:val="22"/>
+              </w:rPr>
+              <w:t>✅ Engine OpenBIM tự chủ mã nguồn (ThatOpen + xeokit)</w:t>
+            </w:r>
+          </w:p>
+        </w:tc>
+        <w:tc>
+          <w:tcPr>
+            <w:tcW w:type="dxa" w:w="3120"/>
+          </w:tcPr>
+          <w:p>
+            <w:pPr>
+              <w:spacing w:before="20" w:after="20" w:line="276" w:lineRule="auto"/>
+              <w:jc w:val="left"/>
+            </w:pPr>
+            <w:r>
+              <w:rPr>
+                <w:rFonts w:ascii="Times New Roman" w:hAnsi="Times New Roman" w:cs="Times New Roman" w:eastAsia="Times New Roman"/>
+                <w:b w:val="0"/>
+                <w:i w:val="0"/>
+                <w:sz w:val="22"/>
+              </w:rPr>
+              <w:t>⚠️ Ưu tiên định dạng đóng (.rvt, .nwd)</w:t>
+            </w:r>
+          </w:p>
+        </w:tc>
+      </w:tr>
+      <w:tr>
+        <w:tc>
+          <w:tcPr>
+            <w:tcW w:type="dxa" w:w="3120"/>
+          </w:tcPr>
+          <w:p>
+            <w:pPr>
+              <w:spacing w:before="20" w:after="20" w:line="276" w:lineRule="auto"/>
+              <w:jc w:val="left"/>
+            </w:pPr>
+            <w:r>
+              <w:rPr>
+                <w:rFonts w:ascii="Times New Roman" w:hAnsi="Times New Roman" w:cs="Times New Roman" w:eastAsia="Times New Roman"/>
+                <w:b/>
+                <w:i w:val="0"/>
+                <w:sz w:val="22"/>
+              </w:rPr>
+              <w:t>Liên thông CSDL quốc gia</w:t>
+            </w:r>
+            <w:r>
+              <w:rPr>
+                <w:rFonts w:ascii="Times New Roman" w:hAnsi="Times New Roman" w:cs="Times New Roman" w:eastAsia="Times New Roman"/>
+                <w:b w:val="0"/>
+                <w:i w:val="0"/>
+                <w:sz w:val="22"/>
+              </w:rPr>
+              <w:t xml:space="preserve"> (NDXP, mã dự án 13 ký tự theo TT 24/2025/TT-BXD)</w:t>
+            </w:r>
+          </w:p>
+        </w:tc>
+        <w:tc>
+          <w:tcPr>
+            <w:tcW w:type="dxa" w:w="3120"/>
+          </w:tcPr>
+          <w:p>
+            <w:pPr>
+              <w:spacing w:before="20" w:after="20" w:line="276" w:lineRule="auto"/>
+              <w:jc w:val="left"/>
+            </w:pPr>
+            <w:r>
+              <w:rPr>
+                <w:rFonts w:ascii="Times New Roman" w:hAnsi="Times New Roman" w:cs="Times New Roman" w:eastAsia="Times New Roman"/>
+                <w:b w:val="0"/>
+                <w:i w:val="0"/>
+                <w:sz w:val="22"/>
+              </w:rPr>
+              <w:t>✅ Tích hợp API sẵn</w:t>
+            </w:r>
+          </w:p>
+        </w:tc>
+        <w:tc>
+          <w:tcPr>
+            <w:tcW w:type="dxa" w:w="3120"/>
+          </w:tcPr>
+          <w:p>
+            <w:pPr>
+              <w:spacing w:before="20" w:after="20" w:line="276" w:lineRule="auto"/>
+              <w:jc w:val="left"/>
+            </w:pPr>
+            <w:r>
+              <w:rPr>
+                <w:rFonts w:ascii="Times New Roman" w:hAnsi="Times New Roman" w:cs="Times New Roman" w:eastAsia="Times New Roman"/>
+                <w:b w:val="0"/>
+                <w:i w:val="0"/>
+                <w:sz w:val="22"/>
+              </w:rPr>
+              <w:t>❌ Không hỗ trợ</w:t>
+            </w:r>
+          </w:p>
+        </w:tc>
+      </w:tr>
+      <w:tr>
+        <w:tc>
+          <w:tcPr>
+            <w:tcW w:type="dxa" w:w="3120"/>
+          </w:tcPr>
+          <w:p>
+            <w:pPr>
+              <w:spacing w:before="20" w:after="20" w:line="276" w:lineRule="auto"/>
+              <w:jc w:val="left"/>
+            </w:pPr>
+            <w:r>
+              <w:rPr>
+                <w:rFonts w:ascii="Times New Roman" w:hAnsi="Times New Roman" w:cs="Times New Roman" w:eastAsia="Times New Roman"/>
+                <w:b/>
+                <w:i w:val="0"/>
+                <w:sz w:val="22"/>
+              </w:rPr>
+              <w:t>Mã hóa, MFA, RBAC, SIEM, WORM</w:t>
+            </w:r>
+            <w:r>
+              <w:rPr>
+                <w:rFonts w:ascii="Times New Roman" w:hAnsi="Times New Roman" w:cs="Times New Roman" w:eastAsia="Times New Roman"/>
+                <w:b w:val="0"/>
+                <w:i w:val="0"/>
+                <w:sz w:val="22"/>
+              </w:rPr>
+              <w:t xml:space="preserve"> (QCVN 12 Đ.2.2.7, 2.2.9, 2.2.22)</w:t>
+            </w:r>
+          </w:p>
+        </w:tc>
+        <w:tc>
+          <w:tcPr>
+            <w:tcW w:type="dxa" w:w="3120"/>
+          </w:tcPr>
+          <w:p>
+            <w:pPr>
+              <w:spacing w:before="20" w:after="20" w:line="276" w:lineRule="auto"/>
+              <w:jc w:val="left"/>
+            </w:pPr>
+            <w:r>
+              <w:rPr>
+                <w:rFonts w:ascii="Times New Roman" w:hAnsi="Times New Roman" w:cs="Times New Roman" w:eastAsia="Times New Roman"/>
+                <w:b w:val="0"/>
+                <w:i w:val="0"/>
+                <w:sz w:val="22"/>
+              </w:rPr>
+              <w:t>✅ Đầy đủ</w:t>
+            </w:r>
+          </w:p>
+        </w:tc>
+        <w:tc>
+          <w:tcPr>
+            <w:tcW w:type="dxa" w:w="3120"/>
+          </w:tcPr>
+          <w:p>
+            <w:pPr>
+              <w:spacing w:before="20" w:after="20" w:line="276" w:lineRule="auto"/>
+              <w:jc w:val="left"/>
+            </w:pPr>
+            <w:r>
+              <w:rPr>
+                <w:rFonts w:ascii="Times New Roman" w:hAnsi="Times New Roman" w:cs="Times New Roman" w:eastAsia="Times New Roman"/>
+                <w:b w:val="0"/>
+                <w:i w:val="0"/>
+                <w:sz w:val="22"/>
+              </w:rPr>
+              <w:t>⚠️ Có MFA, RBAC nhưng không WORM/SIEM theo chuẩn VN</w:t>
+            </w:r>
+          </w:p>
+        </w:tc>
+      </w:tr>
+      <w:tr>
+        <w:tc>
+          <w:tcPr>
+            <w:tcW w:type="dxa" w:w="3120"/>
+          </w:tcPr>
+          <w:p>
+            <w:pPr>
+              <w:spacing w:before="20" w:after="20" w:line="276" w:lineRule="auto"/>
+              <w:jc w:val="left"/>
+            </w:pPr>
+            <w:r>
+              <w:rPr>
+                <w:rFonts w:ascii="Times New Roman" w:hAnsi="Times New Roman" w:cs="Times New Roman" w:eastAsia="Times New Roman"/>
+                <w:b/>
+                <w:i w:val="0"/>
+                <w:sz w:val="22"/>
+              </w:rPr>
+              <w:t>Dấu thời gian (Timestamping)</w:t>
+            </w:r>
+            <w:r>
+              <w:rPr>
+                <w:rFonts w:ascii="Times New Roman" w:hAnsi="Times New Roman" w:cs="Times New Roman" w:eastAsia="Times New Roman"/>
+                <w:b w:val="0"/>
+                <w:i w:val="0"/>
+                <w:sz w:val="22"/>
+              </w:rPr>
+              <w:t xml:space="preserve"> (QCVN 12 Đ.2.2.22)</w:t>
+            </w:r>
+          </w:p>
+        </w:tc>
+        <w:tc>
+          <w:tcPr>
+            <w:tcW w:type="dxa" w:w="3120"/>
+          </w:tcPr>
+          <w:p>
+            <w:pPr>
+              <w:spacing w:before="20" w:after="20" w:line="276" w:lineRule="auto"/>
+              <w:jc w:val="left"/>
+            </w:pPr>
+            <w:r>
+              <w:rPr>
+                <w:rFonts w:ascii="Times New Roman" w:hAnsi="Times New Roman" w:cs="Times New Roman" w:eastAsia="Times New Roman"/>
+                <w:b w:val="0"/>
+                <w:i w:val="0"/>
+                <w:sz w:val="22"/>
+              </w:rPr>
+              <w:t>✅ UTC chuẩn xác, Audit Trail bất biến</w:t>
+            </w:r>
+          </w:p>
+        </w:tc>
+        <w:tc>
+          <w:tcPr>
+            <w:tcW w:type="dxa" w:w="3120"/>
+          </w:tcPr>
+          <w:p>
+            <w:pPr>
+              <w:spacing w:before="20" w:after="20" w:line="276" w:lineRule="auto"/>
+              <w:jc w:val="left"/>
+            </w:pPr>
+            <w:r>
+              <w:rPr>
+                <w:rFonts w:ascii="Times New Roman" w:hAnsi="Times New Roman" w:cs="Times New Roman" w:eastAsia="Times New Roman"/>
+                <w:b w:val="0"/>
+                <w:i w:val="0"/>
+                <w:sz w:val="22"/>
+              </w:rPr>
+              <w:t>⚠️ Có nhưng không chứng nhận theo pháp luật VN</w:t>
+            </w:r>
+          </w:p>
+        </w:tc>
+      </w:tr>
+      <w:tr>
+        <w:tc>
+          <w:tcPr>
+            <w:tcW w:type="dxa" w:w="3120"/>
+          </w:tcPr>
+          <w:p>
+            <w:pPr>
+              <w:spacing w:before="20" w:after="20" w:line="276" w:lineRule="auto"/>
+              <w:jc w:val="left"/>
+            </w:pPr>
+            <w:r>
+              <w:rPr>
+                <w:rFonts w:ascii="Times New Roman" w:hAnsi="Times New Roman" w:cs="Times New Roman" w:eastAsia="Times New Roman"/>
+                <w:b/>
+                <w:i w:val="0"/>
+                <w:sz w:val="22"/>
+              </w:rPr>
+              <w:t>Hỗ trợ tiếng Việt &amp; nghiệp vụ BEP/EIR nội địa</w:t>
+            </w:r>
+          </w:p>
+        </w:tc>
+        <w:tc>
+          <w:tcPr>
+            <w:tcW w:type="dxa" w:w="3120"/>
+          </w:tcPr>
+          <w:p>
+            <w:pPr>
+              <w:spacing w:before="20" w:after="20" w:line="276" w:lineRule="auto"/>
+              <w:jc w:val="left"/>
+            </w:pPr>
+            <w:r>
+              <w:rPr>
+                <w:rFonts w:ascii="Times New Roman" w:hAnsi="Times New Roman" w:cs="Times New Roman" w:eastAsia="Times New Roman"/>
+                <w:b w:val="0"/>
+                <w:i w:val="0"/>
+                <w:sz w:val="22"/>
+              </w:rPr>
+              <w:t>✅ Hoàn toàn</w:t>
+            </w:r>
+          </w:p>
+        </w:tc>
+        <w:tc>
+          <w:tcPr>
+            <w:tcW w:type="dxa" w:w="3120"/>
+          </w:tcPr>
+          <w:p>
+            <w:pPr>
+              <w:spacing w:before="20" w:after="20" w:line="276" w:lineRule="auto"/>
+              <w:jc w:val="left"/>
+            </w:pPr>
+            <w:r>
+              <w:rPr>
+                <w:rFonts w:ascii="Times New Roman" w:hAnsi="Times New Roman" w:cs="Times New Roman" w:eastAsia="Times New Roman"/>
+                <w:b w:val="0"/>
+                <w:i w:val="0"/>
+                <w:sz w:val="22"/>
+              </w:rPr>
+              <w:t>❌ Giao diện tiếng Anh, không bản địa hóa</w:t>
+            </w:r>
+          </w:p>
+        </w:tc>
+      </w:tr>
+      <w:tr>
+        <w:tc>
+          <w:tcPr>
+            <w:tcW w:type="dxa" w:w="3120"/>
+          </w:tcPr>
+          <w:p>
+            <w:pPr>
+              <w:spacing w:before="20" w:after="20" w:line="276" w:lineRule="auto"/>
+              <w:jc w:val="left"/>
+            </w:pPr>
+            <w:r>
+              <w:rPr>
+                <w:rFonts w:ascii="Times New Roman" w:hAnsi="Times New Roman" w:cs="Times New Roman" w:eastAsia="Times New Roman"/>
+                <w:b/>
+                <w:i w:val="0"/>
+                <w:sz w:val="22"/>
+              </w:rPr>
+              <w:t>Mô hình chi phí</w:t>
+            </w:r>
+          </w:p>
+        </w:tc>
+        <w:tc>
+          <w:tcPr>
+            <w:tcW w:type="dxa" w:w="3120"/>
+          </w:tcPr>
+          <w:p>
+            <w:pPr>
+              <w:spacing w:before="20" w:after="20" w:line="276" w:lineRule="auto"/>
+              <w:jc w:val="center"/>
+            </w:pPr>
+            <w:r>
+              <w:rPr>
+                <w:rFonts w:ascii="Times New Roman" w:hAnsi="Times New Roman" w:cs="Times New Roman" w:eastAsia="Times New Roman"/>
+                <w:b/>
+                <w:i w:val="0"/>
+                <w:sz w:val="22"/>
+              </w:rPr>
+              <w:t>Tách riêng</w:t>
+            </w:r>
+            <w:r>
+              <w:rPr>
+                <w:rFonts w:ascii="Times New Roman" w:hAnsi="Times New Roman" w:cs="Times New Roman" w:eastAsia="Times New Roman"/>
+                <w:b w:val="0"/>
+                <w:i w:val="0"/>
+                <w:sz w:val="22"/>
+              </w:rPr>
+              <w:t>: Hạ tầng (Ban chi trả) + Phần mềm CDE (~150 triệu/năm) — không tính theo đầu user</w:t>
+            </w:r>
+          </w:p>
+        </w:tc>
+        <w:tc>
+          <w:tcPr>
+            <w:tcW w:type="dxa" w:w="3120"/>
+          </w:tcPr>
+          <w:p>
+            <w:pPr>
+              <w:spacing w:before="20" w:after="20" w:line="276" w:lineRule="auto"/>
+              <w:jc w:val="center"/>
+            </w:pPr>
+            <w:r>
+              <w:rPr>
+                <w:rFonts w:ascii="Times New Roman" w:hAnsi="Times New Roman" w:cs="Times New Roman" w:eastAsia="Times New Roman"/>
+                <w:b w:val="0"/>
+                <w:i w:val="0"/>
+                <w:sz w:val="22"/>
+              </w:rPr>
+              <w:t>Đắt — tính theo user (1,5–2,5 triệu VNĐ/user/tháng × số user)</w:t>
+            </w:r>
+          </w:p>
+        </w:tc>
+      </w:tr>
+    </w:tbl>
+    <w:p>
+      <w:pPr>
+        <w:spacing w:before="40" w:after="40" w:lineRule="auto" w:line="276"/>
+        <w:ind w:firstLine="720"/>
+        <w:jc w:val="both"/>
+      </w:pPr>
+      <w:r>
+        <w:rPr>
+          <w:rFonts w:ascii="Times New Roman" w:hAnsi="Times New Roman" w:cs="Times New Roman" w:eastAsia="Times New Roman"/>
+          <w:b w:val="0"/>
+          <w:i w:val="0"/>
+          <w:sz w:val="26"/>
+        </w:rPr>
+        <w:t xml:space="preserve">Chúng tôi đề xuất Ban triển khai nền tảng CDE CIC với </w:t>
+      </w:r>
+      <w:r>
+        <w:rPr>
+          <w:rFonts w:ascii="Times New Roman" w:hAnsi="Times New Roman" w:cs="Times New Roman" w:eastAsia="Times New Roman"/>
+          <w:b/>
+          <w:i w:val="0"/>
+          <w:sz w:val="26"/>
+        </w:rPr>
+        <w:t>02 phân hệ lõi</w:t>
+      </w:r>
+      <w:r>
+        <w:rPr>
+          <w:rFonts w:ascii="Times New Roman" w:hAnsi="Times New Roman" w:cs="Times New Roman" w:eastAsia="Times New Roman"/>
+          <w:b w:val="0"/>
+          <w:i w:val="0"/>
+          <w:sz w:val="26"/>
+        </w:rPr>
+        <w:t xml:space="preserve"> trong giai đoạn đầu, đáp ứng đầy đủ yêu cầu pháp lý và nghiệp vụ:</w:t>
+      </w:r>
+    </w:p>
+    <w:p>
+      <w:pPr>
+        <w:spacing w:before="160" w:after="40" w:lineRule="auto" w:line="276"/>
+        <w:jc w:val="left"/>
+      </w:pPr>
+      <w:r>
+        <w:rPr>
+          <w:rFonts w:ascii="Times New Roman" w:hAnsi="Times New Roman" w:cs="Times New Roman" w:eastAsia="Times New Roman"/>
+          <w:b/>
+          <w:i/>
+          <w:sz w:val="26"/>
+        </w:rPr>
+        <w:t>Phân hệ 1: Quản lý Tài liệu và Luồng Phê duyệt (Document &amp; Workflow Management)</w:t>
+      </w:r>
+    </w:p>
+    <w:p>
+      <w:pPr>
+        <w:spacing w:before="40" w:after="40" w:lineRule="auto" w:line="276"/>
+        <w:ind w:firstLine="720"/>
+        <w:jc w:val="both"/>
+      </w:pPr>
+      <w:r>
+        <w:rPr>
+          <w:rFonts w:ascii="Times New Roman" w:hAnsi="Times New Roman" w:cs="Times New Roman" w:eastAsia="Times New Roman"/>
+          <w:b w:val="0"/>
+          <w:i w:val="0"/>
+          <w:sz w:val="26"/>
+        </w:rPr>
+        <w:t>Module lõi của CDE theo ISO 19650, cung cấp:</w:t>
+      </w:r>
+    </w:p>
+    <w:p>
+      <w:pPr>
+        <w:spacing w:before="20" w:after="20"/>
+        <w:ind w:left="360"/>
+        <w:jc w:val="both"/>
+      </w:pPr>
+      <w:r>
+        <w:rPr>
+          <w:rFonts w:ascii="Times New Roman" w:hAnsi="Times New Roman" w:cs="Times New Roman" w:eastAsia="Times New Roman"/>
+          <w:b/>
+          <w:i w:val="0"/>
+          <w:sz w:val="26"/>
+        </w:rPr>
+        <w:t xml:space="preserve">• **Quản lý vòng đời tài liệu 4 trạng thái**: </w:t>
+      </w:r>
+      <w:r>
+        <w:rPr>
+          <w:rFonts w:ascii="Times New Roman" w:hAnsi="Times New Roman" w:cs="Times New Roman" w:eastAsia="Times New Roman"/>
+          <w:b w:val="0"/>
+          <w:i w:val="0"/>
+          <w:sz w:val="26"/>
+        </w:rPr>
+        <w:t>WIP (S0) → Shared (S1) → Published (S2) → Archive (S3) với kiểm soát cổng duyệt (Gate 1, Gate 2) rõ ràng.</w:t>
+      </w:r>
+    </w:p>
+    <w:p>
+      <w:pPr>
+        <w:spacing w:before="20" w:after="20"/>
+        <w:ind w:left="360"/>
+        <w:jc w:val="both"/>
+      </w:pPr>
+      <w:r>
+        <w:rPr>
+          <w:rFonts w:ascii="Times New Roman" w:hAnsi="Times New Roman" w:cs="Times New Roman" w:eastAsia="Times New Roman"/>
+          <w:b/>
+          <w:i w:val="0"/>
+          <w:sz w:val="26"/>
+        </w:rPr>
+        <w:t xml:space="preserve">• **Đặt tên tài liệu chuẩn ISO 19650**: </w:t>
+      </w:r>
+      <w:r>
+        <w:rPr>
+          <w:rFonts w:ascii="Times New Roman" w:hAnsi="Times New Roman" w:cs="Times New Roman" w:eastAsia="Times New Roman"/>
+          <w:b w:val="0"/>
+          <w:i w:val="0"/>
+          <w:sz w:val="26"/>
+        </w:rPr>
+        <w:t>`[Dự án]-[Đơn vị]-[Khối]-[Tầng]-[Loại]-[Bộ môn]-[Số hiệu]`.</w:t>
+      </w:r>
+    </w:p>
+    <w:p>
+      <w:pPr>
+        <w:spacing w:before="20" w:after="20"/>
+        <w:ind w:left="360"/>
+        <w:jc w:val="both"/>
+      </w:pPr>
+      <w:r>
+        <w:rPr>
+          <w:rFonts w:ascii="Times New Roman" w:hAnsi="Times New Roman" w:cs="Times New Roman" w:eastAsia="Times New Roman"/>
+          <w:b/>
+          <w:i w:val="0"/>
+          <w:sz w:val="26"/>
+        </w:rPr>
+        <w:t xml:space="preserve">• **Quản lý phiên bản tự động**: </w:t>
+      </w:r>
+      <w:r>
+        <w:rPr>
+          <w:rFonts w:ascii="Times New Roman" w:hAnsi="Times New Roman" w:cs="Times New Roman" w:eastAsia="Times New Roman"/>
+          <w:b w:val="0"/>
+          <w:i w:val="0"/>
+          <w:sz w:val="26"/>
+        </w:rPr>
+        <w:t>Tăng revision P01→P02... (bản nháp) → C01, C02... (bản chính thức) khi xuất bản.</w:t>
+      </w:r>
+    </w:p>
+    <w:p>
+      <w:pPr>
+        <w:spacing w:before="20" w:after="20"/>
+        <w:ind w:left="360"/>
+        <w:jc w:val="both"/>
+      </w:pPr>
+      <w:r>
+        <w:rPr>
+          <w:rFonts w:ascii="Times New Roman" w:hAnsi="Times New Roman" w:cs="Times New Roman" w:eastAsia="Times New Roman"/>
+          <w:b/>
+          <w:i w:val="0"/>
+          <w:sz w:val="26"/>
+        </w:rPr>
+        <w:t xml:space="preserve">• **Lịch sử phiên bản hoàn chỉnh**: </w:t>
+      </w:r>
+      <w:r>
+        <w:rPr>
+          <w:rFonts w:ascii="Times New Roman" w:hAnsi="Times New Roman" w:cs="Times New Roman" w:eastAsia="Times New Roman"/>
+          <w:b w:val="0"/>
+          <w:i w:val="0"/>
+          <w:sz w:val="26"/>
+        </w:rPr>
+        <w:t>Snapshot mỗi lần tải lên/đổi trạng thái/thay đổi revision, tạo Audit Trail bất biến đáp ứng QCVN 12 (Mục 2.2.22 — Dấu thời gian).</w:t>
+      </w:r>
+    </w:p>
+    <w:p>
+      <w:pPr>
+        <w:spacing w:before="20" w:after="20"/>
+        <w:ind w:left="360"/>
+        <w:jc w:val="both"/>
+      </w:pPr>
+      <w:r>
+        <w:rPr>
+          <w:rFonts w:ascii="Times New Roman" w:hAnsi="Times New Roman" w:cs="Times New Roman" w:eastAsia="Times New Roman"/>
+          <w:b/>
+          <w:i w:val="0"/>
+          <w:sz w:val="26"/>
+        </w:rPr>
+        <w:t xml:space="preserve">• **Phân quyền theo vai trò (RBAC)**: </w:t>
+      </w:r>
+      <w:r>
+        <w:rPr>
+          <w:rFonts w:ascii="Times New Roman" w:hAnsi="Times New Roman" w:cs="Times New Roman" w:eastAsia="Times New Roman"/>
+          <w:b w:val="0"/>
+          <w:i w:val="0"/>
+          <w:sz w:val="26"/>
+        </w:rPr>
+        <w:t>Author / Checker / Approver / Manager / Viewer — gate duyệt/phát hành/lưu trữ phân quyền rõ ràng, đáp ứng QCVN 12 (Mục 2.2.7).</w:t>
+      </w:r>
+    </w:p>
+    <w:p>
+      <w:pPr>
+        <w:spacing w:before="20" w:after="20"/>
+        <w:ind w:left="360"/>
+        <w:jc w:val="both"/>
+      </w:pPr>
+      <w:r>
+        <w:rPr>
+          <w:rFonts w:ascii="Times New Roman" w:hAnsi="Times New Roman" w:cs="Times New Roman" w:eastAsia="Times New Roman"/>
+          <w:b/>
+          <w:i w:val="0"/>
+          <w:sz w:val="26"/>
+        </w:rPr>
+        <w:t xml:space="preserve">• **Upload file thật + Hash SHA-256**: </w:t>
+      </w:r>
+      <w:r>
+        <w:rPr>
+          <w:rFonts w:ascii="Times New Roman" w:hAnsi="Times New Roman" w:cs="Times New Roman" w:eastAsia="Times New Roman"/>
+          <w:b w:val="0"/>
+          <w:i w:val="0"/>
+          <w:sz w:val="26"/>
+        </w:rPr>
+        <w:t>Mỗi tài liệu được băm SHA-256 để bảo vệ tính toàn vẹn, đáp ứng QCVN 12 (Mục 2.2.5.4.2).</w:t>
+      </w:r>
+    </w:p>
+    <w:p>
+      <w:pPr>
+        <w:spacing w:before="20" w:after="20"/>
+        <w:ind w:left="360"/>
+        <w:jc w:val="both"/>
+      </w:pPr>
+      <w:r>
+        <w:rPr>
+          <w:rFonts w:ascii="Times New Roman" w:hAnsi="Times New Roman" w:cs="Times New Roman" w:eastAsia="Times New Roman"/>
+          <w:b/>
+          <w:i w:val="0"/>
+          <w:sz w:val="26"/>
+        </w:rPr>
+        <w:t xml:space="preserve">• **Kế hoạch bàn giao thông tin (MIDP/TIDP)**: </w:t>
+      </w:r>
+      <w:r>
+        <w:rPr>
+          <w:rFonts w:ascii="Times New Roman" w:hAnsi="Times New Roman" w:cs="Times New Roman" w:eastAsia="Times New Roman"/>
+          <w:b w:val="0"/>
+          <w:i w:val="0"/>
+          <w:sz w:val="26"/>
+        </w:rPr>
+        <w:t>Quản lý nhiệm vụ bàn giao theo bộ môn, định dạng, mốc thời gian, thời hạn, phụ trách — cảnh báo trễ hạn tự động.</w:t>
+      </w:r>
+    </w:p>
+    <w:p>
+      <w:pPr>
+        <w:spacing w:before="20" w:after="20"/>
+        <w:ind w:left="360"/>
+        <w:jc w:val="both"/>
+      </w:pPr>
+      <w:r>
+        <w:rPr>
+          <w:rFonts w:ascii="Times New Roman" w:hAnsi="Times New Roman" w:cs="Times New Roman" w:eastAsia="Times New Roman"/>
+          <w:b/>
+          <w:i w:val="0"/>
+          <w:sz w:val="26"/>
+        </w:rPr>
+        <w:t xml:space="preserve">• **Mã hóa dữ liệu** </w:t>
+      </w:r>
+      <w:r>
+        <w:rPr>
+          <w:rFonts w:ascii="Times New Roman" w:hAnsi="Times New Roman" w:cs="Times New Roman" w:eastAsia="Times New Roman"/>
+          <w:b w:val="0"/>
+          <w:i w:val="0"/>
+          <w:sz w:val="26"/>
+        </w:rPr>
+        <w:t>lưu trữ và truyền tải, đáp ứng QCVN 12 (Mục 2.2.16.2).</w:t>
+      </w:r>
+    </w:p>
+    <w:p>
+      <w:pPr>
+        <w:spacing w:before="160" w:after="40" w:lineRule="auto" w:line="276"/>
+        <w:jc w:val="left"/>
+      </w:pPr>
+      <w:r>
+        <w:rPr>
+          <w:rFonts w:ascii="Times New Roman" w:hAnsi="Times New Roman" w:cs="Times New Roman" w:eastAsia="Times New Roman"/>
+          <w:b/>
+          <w:i/>
+          <w:sz w:val="26"/>
+        </w:rPr>
+        <w:t>Phân hệ 2: Trình xem và Phối hợp Mô hình 3D (BIM 3D/IFC Viewer &amp; Coordination)</w:t>
+      </w:r>
+    </w:p>
+    <w:p>
+      <w:pPr>
+        <w:spacing w:before="40" w:after="40" w:lineRule="auto" w:line="276"/>
+        <w:ind w:firstLine="720"/>
+        <w:jc w:val="both"/>
+      </w:pPr>
+      <w:r>
+        <w:rPr>
+          <w:rFonts w:ascii="Times New Roman" w:hAnsi="Times New Roman" w:cs="Times New Roman" w:eastAsia="Times New Roman"/>
+          <w:b w:val="0"/>
+          <w:i w:val="0"/>
+          <w:sz w:val="26"/>
+        </w:rPr>
+        <w:t>Hỗ trợ đắc lực cho công tác trực quan hóa và phối hợp mô hình BIM 3D trực tiếp trên trình duyệt Web:</w:t>
+      </w:r>
+    </w:p>
+    <w:p>
+      <w:pPr>
+        <w:spacing w:before="20" w:after="20"/>
+        <w:ind w:left="360"/>
+        <w:jc w:val="both"/>
+      </w:pPr>
+      <w:r>
+        <w:rPr>
+          <w:rFonts w:ascii="Times New Roman" w:hAnsi="Times New Roman" w:cs="Times New Roman" w:eastAsia="Times New Roman"/>
+          <w:b/>
+          <w:i w:val="0"/>
+          <w:sz w:val="26"/>
+        </w:rPr>
+        <w:t xml:space="preserve">• **BIM Viewer trên trình duyệt Web** </w:t>
+      </w:r>
+      <w:r>
+        <w:rPr>
+          <w:rFonts w:ascii="Times New Roman" w:hAnsi="Times New Roman" w:cs="Times New Roman" w:eastAsia="Times New Roman"/>
+          <w:b w:val="0"/>
+          <w:i w:val="0"/>
+          <w:sz w:val="26"/>
+        </w:rPr>
+        <w:t xml:space="preserve">(không cần cài đặt phần mềm): Đọc mượt mà định dạng chuẩn mở </w:t>
+      </w:r>
+      <w:r>
+        <w:rPr>
+          <w:rFonts w:ascii="Times New Roman" w:hAnsi="Times New Roman" w:cs="Times New Roman" w:eastAsia="Times New Roman"/>
+          <w:b/>
+          <w:i w:val="0"/>
+          <w:sz w:val="26"/>
+        </w:rPr>
+        <w:t>IFC 4.0+</w:t>
+      </w:r>
+      <w:r>
+        <w:rPr>
+          <w:rFonts w:ascii="Times New Roman" w:hAnsi="Times New Roman" w:cs="Times New Roman" w:eastAsia="Times New Roman"/>
+          <w:b w:val="0"/>
+          <w:i w:val="0"/>
+          <w:sz w:val="26"/>
+        </w:rPr>
+        <w:t xml:space="preserve"> trên engine OpenBIM tự chủ mã nguồn (ThatOpen Engine / WebGL).</w:t>
+      </w:r>
+    </w:p>
+    <w:p>
+      <w:pPr>
+        <w:spacing w:before="20" w:after="20"/>
+        <w:ind w:left="360"/>
+        <w:jc w:val="both"/>
+      </w:pPr>
+      <w:r>
+        <w:rPr>
+          <w:rFonts w:ascii="Times New Roman" w:hAnsi="Times New Roman" w:cs="Times New Roman" w:eastAsia="Times New Roman"/>
+          <w:b/>
+          <w:i w:val="0"/>
+          <w:sz w:val="26"/>
+        </w:rPr>
+        <w:t xml:space="preserve">• **Navigation đầy đủ**: </w:t>
+      </w:r>
+      <w:r>
+        <w:rPr>
+          <w:rFonts w:ascii="Times New Roman" w:hAnsi="Times New Roman" w:cs="Times New Roman" w:eastAsia="Times New Roman"/>
+          <w:b w:val="0"/>
+          <w:i w:val="0"/>
+          <w:sz w:val="26"/>
+        </w:rPr>
+        <w:t>Orbit, pan, zoom, section planes, chế độ Bay (WASD + Q/E + Shift 2x).</w:t>
+      </w:r>
+    </w:p>
+    <w:p>
+      <w:pPr>
+        <w:spacing w:before="20" w:after="20"/>
+        <w:ind w:left="360"/>
+        <w:jc w:val="both"/>
+      </w:pPr>
+      <w:r>
+        <w:rPr>
+          <w:rFonts w:ascii="Times New Roman" w:hAnsi="Times New Roman" w:cs="Times New Roman" w:eastAsia="Times New Roman"/>
+          <w:b/>
+          <w:i w:val="0"/>
+          <w:sz w:val="26"/>
+        </w:rPr>
+        <w:t xml:space="preserve">• **Phối hợp đa mô hình (Model Federation)**: </w:t>
+      </w:r>
+      <w:r>
+        <w:rPr>
+          <w:rFonts w:ascii="Times New Roman" w:hAnsi="Times New Roman" w:cs="Times New Roman" w:eastAsia="Times New Roman"/>
+          <w:b w:val="0"/>
+          <w:i w:val="0"/>
+          <w:sz w:val="26"/>
+        </w:rPr>
+        <w:t>Tải nhiều model IFC cùng lúc, nhóm theo bộ môn, bật/tắt từng model.</w:t>
+      </w:r>
+    </w:p>
+    <w:p>
+      <w:pPr>
+        <w:spacing w:before="20" w:after="20"/>
+        <w:ind w:left="360"/>
+        <w:jc w:val="both"/>
+      </w:pPr>
+      <w:r>
+        <w:rPr>
+          <w:rFonts w:ascii="Times New Roman" w:hAnsi="Times New Roman" w:cs="Times New Roman" w:eastAsia="Times New Roman"/>
+          <w:b/>
+          <w:i w:val="0"/>
+          <w:sz w:val="26"/>
+        </w:rPr>
+        <w:t xml:space="preserve">• **Quản lý vấn đề kiểu BCF (Issues)**: </w:t>
+      </w:r>
+      <w:r>
+        <w:rPr>
+          <w:rFonts w:ascii="Times New Roman" w:hAnsi="Times New Roman" w:cs="Times New Roman" w:eastAsia="Times New Roman"/>
+          <w:b w:val="0"/>
+          <w:i w:val="0"/>
+          <w:sz w:val="26"/>
+        </w:rPr>
+        <w:t>Tạo issue gắn viewpoint (camera + ảnh thumbnail), gán người phụ trách, workflow trạng thái Open → Đang xử lý → Đã xử lý → Đã đóng. Xuất/nhập BCF 2.1.</w:t>
+      </w:r>
+    </w:p>
+    <w:p>
+      <w:pPr>
+        <w:spacing w:before="20" w:after="20"/>
+        <w:ind w:left="360"/>
+        <w:jc w:val="both"/>
+      </w:pPr>
+      <w:r>
+        <w:rPr>
+          <w:rFonts w:ascii="Times New Roman" w:hAnsi="Times New Roman" w:cs="Times New Roman" w:eastAsia="Times New Roman"/>
+          <w:b/>
+          <w:i w:val="0"/>
+          <w:sz w:val="26"/>
+        </w:rPr>
+        <w:t xml:space="preserve">• **Lưu/khôi phục Viewpoint**: </w:t>
+      </w:r>
+      <w:r>
+        <w:rPr>
+          <w:rFonts w:ascii="Times New Roman" w:hAnsi="Times New Roman" w:cs="Times New Roman" w:eastAsia="Times New Roman"/>
+          <w:b w:val="0"/>
+          <w:i w:val="0"/>
+          <w:sz w:val="26"/>
+        </w:rPr>
+        <w:t>Camera + ẩn/hiện model + screenshot lưu trữ đám mây.</w:t>
+      </w:r>
+    </w:p>
+    <w:p>
+      <w:pPr>
+        <w:spacing w:before="20" w:after="20"/>
+        <w:ind w:left="360"/>
+        <w:jc w:val="both"/>
+      </w:pPr>
+      <w:r>
+        <w:rPr>
+          <w:rFonts w:ascii="Times New Roman" w:hAnsi="Times New Roman" w:cs="Times New Roman" w:eastAsia="Times New Roman"/>
+          <w:b/>
+          <w:i w:val="0"/>
+          <w:sz w:val="26"/>
+        </w:rPr>
+        <w:t xml:space="preserve">• **Kiểm tra thuộc tính cấu kiện**: </w:t>
+      </w:r>
+      <w:r>
+        <w:rPr>
+          <w:rFonts w:ascii="Times New Roman" w:hAnsi="Times New Roman" w:cs="Times New Roman" w:eastAsia="Times New Roman"/>
+          <w:b w:val="0"/>
+          <w:i w:val="0"/>
+          <w:sz w:val="26"/>
+        </w:rPr>
+        <w:t>Chọn đối tượng, xem toàn bộ Property Set, đo đạc khoảng cách.</w:t>
+      </w:r>
+    </w:p>
+    <w:p>
+      <w:pPr>
+        <w:spacing w:before="200" w:after="60" w:lineRule="auto" w:line="276"/>
+        <w:jc w:val="left"/>
+      </w:pPr>
+      <w:r>
+        <w:rPr>
+          <w:rFonts w:ascii="Times New Roman" w:hAnsi="Times New Roman" w:cs="Times New Roman" w:eastAsia="Times New Roman"/>
+          <w:b/>
+          <w:i w:val="0"/>
+          <w:sz w:val="26"/>
+        </w:rPr>
+        <w:t>4. Chi phí dự kiến CDE CIC (Phân hệ 1 + 2)</w:t>
+      </w:r>
+    </w:p>
+    <w:p>
+      <w:pPr>
+        <w:spacing w:before="40" w:after="40" w:lineRule="auto" w:line="276"/>
+        <w:ind w:firstLine="720"/>
+        <w:jc w:val="both"/>
+      </w:pPr>
+      <w:r>
+        <w:rPr>
+          <w:rFonts w:ascii="Times New Roman" w:hAnsi="Times New Roman" w:cs="Times New Roman" w:eastAsia="Times New Roman"/>
+          <w:b w:val="0"/>
+          <w:i w:val="0"/>
+          <w:sz w:val="26"/>
+        </w:rPr>
+        <w:t xml:space="preserve">CDE CIC áp dụng mô hình chi phí </w:t>
+      </w:r>
+      <w:r>
+        <w:rPr>
+          <w:rFonts w:ascii="Times New Roman" w:hAnsi="Times New Roman" w:cs="Times New Roman" w:eastAsia="Times New Roman"/>
+          <w:b/>
+          <w:i w:val="0"/>
+          <w:sz w:val="26"/>
+        </w:rPr>
+        <w:t>tách riêng hạ tầng và phần mềm</w:t>
+      </w:r>
+      <w:r>
+        <w:rPr>
+          <w:rFonts w:ascii="Times New Roman" w:hAnsi="Times New Roman" w:cs="Times New Roman" w:eastAsia="Times New Roman"/>
+          <w:b w:val="0"/>
+          <w:i w:val="0"/>
+          <w:sz w:val="26"/>
+        </w:rPr>
+        <w:t>, không tính theo đầu người dùng (user), cụ thể:</w:t>
+      </w:r>
+    </w:p>
+    <w:tbl>
+      <w:tblPr>
+        <w:tblW w:type="auto" w:w="0"/>
+        <w:jc w:val="center"/>
+        <w:tblLayout w:type="autofit"/>
+        <w:tblLook w:firstColumn="1" w:firstRow="1" w:lastColumn="0" w:lastRow="0" w:noHBand="0" w:noVBand="1" w:val="04A0"/>
+        <w:tblBorders>
+          <w:top w:val="single" w:sz="4" w:space="0" w:color="000000"/>
+          <w:left w:val="single" w:sz="4" w:space="0" w:color="000000"/>
+          <w:bottom w:val="single" w:sz="4" w:space="0" w:color="000000"/>
+          <w:right w:val="single" w:sz="4" w:space="0" w:color="000000"/>
+          <w:insideH w:val="single" w:sz="4" w:space="0" w:color="000000"/>
+          <w:insideV w:val="single" w:sz="4" w:space="0" w:color="000000"/>
+        </w:tblBorders>
+      </w:tblPr>
+      <w:tblGrid>
+        <w:gridCol w:w="1872"/>
+        <w:gridCol w:w="1872"/>
+        <w:gridCol w:w="1872"/>
+        <w:gridCol w:w="1872"/>
+        <w:gridCol w:w="1872"/>
+      </w:tblGrid>
+      <w:tr>
+        <w:tc>
+          <w:tcPr>
+            <w:tcW w:type="dxa" w:w="1872"/>
+          </w:tcPr>
+          <w:p>
+            <w:pPr>
+              <w:spacing w:before="20" w:after="20" w:line="276" w:lineRule="auto"/>
+              <w:jc w:val="center"/>
+            </w:pPr>
+            <w:r>
+              <w:rPr>
+                <w:rFonts w:ascii="Times New Roman" w:hAnsi="Times New Roman" w:cs="Times New Roman" w:eastAsia="Times New Roman"/>
+                <w:b/>
+                <w:i w:val="0"/>
+                <w:sz w:val="22"/>
+              </w:rPr>
+              <w:t>STT</w:t>
+            </w:r>
+          </w:p>
+        </w:tc>
+        <w:tc>
+          <w:tcPr>
+            <w:tcW w:type="dxa" w:w="1872"/>
+          </w:tcPr>
+          <w:p>
+            <w:pPr>
+              <w:spacing w:before="20" w:after="20" w:line="276" w:lineRule="auto"/>
+              <w:jc w:val="center"/>
+            </w:pPr>
+            <w:r>
+              <w:rPr>
+                <w:rFonts w:ascii="Times New Roman" w:hAnsi="Times New Roman" w:cs="Times New Roman" w:eastAsia="Times New Roman"/>
+                <w:b/>
+                <w:i w:val="0"/>
+                <w:sz w:val="22"/>
+              </w:rPr>
+              <w:t>Hạng mục</w:t>
+            </w:r>
+          </w:p>
+        </w:tc>
+        <w:tc>
+          <w:tcPr>
+            <w:tcW w:type="dxa" w:w="1872"/>
+          </w:tcPr>
+          <w:p>
+            <w:pPr>
+              <w:spacing w:before="20" w:after="20" w:line="276" w:lineRule="auto"/>
+              <w:jc w:val="center"/>
+            </w:pPr>
+            <w:r>
+              <w:rPr>
+                <w:rFonts w:ascii="Times New Roman" w:hAnsi="Times New Roman" w:cs="Times New Roman" w:eastAsia="Times New Roman"/>
+                <w:b/>
+                <w:i w:val="0"/>
+                <w:sz w:val="22"/>
+              </w:rPr>
+              <w:t>Nội dung</w:t>
+            </w:r>
+          </w:p>
+        </w:tc>
+        <w:tc>
+          <w:tcPr>
+            <w:tcW w:type="dxa" w:w="1872"/>
+          </w:tcPr>
+          <w:p>
+            <w:pPr>
+              <w:spacing w:before="20" w:after="20" w:line="276" w:lineRule="auto"/>
+              <w:jc w:val="center"/>
+            </w:pPr>
+            <w:r>
+              <w:rPr>
+                <w:rFonts w:ascii="Times New Roman" w:hAnsi="Times New Roman" w:cs="Times New Roman" w:eastAsia="Times New Roman"/>
+                <w:b/>
+                <w:i w:val="0"/>
+                <w:sz w:val="22"/>
+              </w:rPr>
+              <w:t>Chi phí dự kiến (VNĐ/năm)</w:t>
+            </w:r>
+          </w:p>
+        </w:tc>
+        <w:tc>
+          <w:tcPr>
+            <w:tcW w:type="dxa" w:w="1872"/>
+          </w:tcPr>
+          <w:p>
+            <w:pPr>
+              <w:spacing w:before="20" w:after="20" w:line="276" w:lineRule="auto"/>
+              <w:jc w:val="center"/>
+            </w:pPr>
+            <w:r>
+              <w:rPr>
+                <w:rFonts w:ascii="Times New Roman" w:hAnsi="Times New Roman" w:cs="Times New Roman" w:eastAsia="Times New Roman"/>
+                <w:b/>
+                <w:i w:val="0"/>
+                <w:sz w:val="22"/>
+              </w:rPr>
+              <w:t>Ghi chú</w:t>
+            </w:r>
+          </w:p>
+        </w:tc>
+      </w:tr>
+      <w:tr>
+        <w:tc>
+          <w:tcPr>
+            <w:tcW w:type="dxa" w:w="1872"/>
+          </w:tcPr>
+          <w:p>
+            <w:pPr>
+              <w:spacing w:before="20" w:after="20" w:line="276" w:lineRule="auto"/>
+              <w:jc w:val="center"/>
+            </w:pPr>
+            <w:r>
+              <w:rPr>
+                <w:rFonts w:ascii="Times New Roman" w:hAnsi="Times New Roman" w:cs="Times New Roman" w:eastAsia="Times New Roman"/>
+                <w:b w:val="0"/>
+                <w:i w:val="0"/>
+                <w:sz w:val="22"/>
+              </w:rPr>
+              <w:t>A</w:t>
+            </w:r>
+          </w:p>
+        </w:tc>
+        <w:tc>
+          <w:tcPr>
+            <w:tcW w:type="dxa" w:w="1872"/>
+          </w:tcPr>
+          <w:p>
+            <w:pPr>
+              <w:spacing w:before="20" w:after="20" w:line="276" w:lineRule="auto"/>
+              <w:jc w:val="left"/>
+            </w:pPr>
+            <w:r>
+              <w:rPr>
+                <w:rFonts w:ascii="Times New Roman" w:hAnsi="Times New Roman" w:cs="Times New Roman" w:eastAsia="Times New Roman"/>
+                <w:b/>
+                <w:i w:val="0"/>
+                <w:sz w:val="22"/>
+              </w:rPr>
+              <w:t>Phần hạ tầng (Infrastructure)</w:t>
+            </w:r>
+          </w:p>
+        </w:tc>
+        <w:tc>
+          <w:tcPr>
+            <w:tcW w:type="dxa" w:w="1872"/>
+          </w:tcPr>
+          <w:p>
+            <w:pPr>
+              <w:spacing w:before="20" w:after="20" w:line="276" w:lineRule="auto"/>
+              <w:jc w:val="left"/>
+            </w:pPr>
+            <w:r>
+              <w:rPr>
+                <w:rFonts w:ascii="Times New Roman" w:hAnsi="Times New Roman" w:cs="Times New Roman" w:eastAsia="Times New Roman"/>
+                <w:b w:val="0"/>
+                <w:i w:val="0"/>
+                <w:sz w:val="22"/>
+              </w:rPr>
+              <w:t>Máy chủ đám mây đặt tại Việt Nam (Viettel Cloud / VNPT — Tier III), dung lượng lưu trữ, băng thông, sao lưu dự phòng, chứng chỉ SSL/TLS</w:t>
+            </w:r>
+          </w:p>
+        </w:tc>
+        <w:tc>
+          <w:tcPr>
+            <w:tcW w:type="dxa" w:w="1872"/>
+          </w:tcPr>
+          <w:p>
+            <w:pPr>
+              <w:spacing w:before="20" w:after="20" w:line="276" w:lineRule="auto"/>
+              <w:jc w:val="left"/>
+            </w:pPr>
+            <w:r>
+              <w:rPr>
+                <w:rFonts w:ascii="Times New Roman" w:hAnsi="Times New Roman" w:cs="Times New Roman" w:eastAsia="Times New Roman"/>
+                <w:b/>
+                <w:i w:val="0"/>
+                <w:sz w:val="22"/>
+              </w:rPr>
+              <w:t>Do Ban chi trả trực tiếp</w:t>
+            </w:r>
+          </w:p>
+        </w:tc>
+        <w:tc>
+          <w:tcPr>
+            <w:tcW w:type="dxa" w:w="1872"/>
+          </w:tcPr>
+          <w:p>
+            <w:pPr>
+              <w:spacing w:before="20" w:after="20" w:line="276" w:lineRule="auto"/>
+              <w:jc w:val="center"/>
+            </w:pPr>
+            <w:r>
+              <w:rPr>
+                <w:rFonts w:ascii="Times New Roman" w:hAnsi="Times New Roman" w:cs="Times New Roman" w:eastAsia="Times New Roman"/>
+                <w:b w:val="0"/>
+                <w:i w:val="0"/>
+                <w:sz w:val="22"/>
+              </w:rPr>
+              <w:t>Ban ký hợp đồng trực tiếp với nhà cung cấp hạ tầng Cloud. Chi phí tùy theo quy mô dung lượng, số lượng dự án và số lượng user truy cập thực tế (Ban sẽ chủ động nâng cấp gói hạ tầng Cloud khi số lượng người dùng tăng lên, dự kiến ban đầu từ 50–100 triệu/năm).</w:t>
+            </w:r>
+          </w:p>
+        </w:tc>
+      </w:tr>
+      <w:tr>
+        <w:tc>
+          <w:tcPr>
+            <w:tcW w:type="dxa" w:w="1872"/>
+          </w:tcPr>
+          <w:p>
+            <w:pPr>
+              <w:spacing w:before="20" w:after="20" w:line="276" w:lineRule="auto"/>
+              <w:jc w:val="center"/>
+            </w:pPr>
+            <w:r>
+              <w:rPr>
+                <w:rFonts w:ascii="Times New Roman" w:hAnsi="Times New Roman" w:cs="Times New Roman" w:eastAsia="Times New Roman"/>
+                <w:b w:val="0"/>
+                <w:i w:val="0"/>
+                <w:sz w:val="22"/>
+              </w:rPr>
+              <w:t>B</w:t>
+            </w:r>
+          </w:p>
+        </w:tc>
+        <w:tc>
+          <w:tcPr>
+            <w:tcW w:type="dxa" w:w="1872"/>
+          </w:tcPr>
+          <w:p>
+            <w:pPr>
+              <w:spacing w:before="20" w:after="20" w:line="276" w:lineRule="auto"/>
+              <w:jc w:val="left"/>
+            </w:pPr>
+            <w:r>
+              <w:rPr>
+                <w:rFonts w:ascii="Times New Roman" w:hAnsi="Times New Roman" w:cs="Times New Roman" w:eastAsia="Times New Roman"/>
+                <w:b/>
+                <w:i w:val="0"/>
+                <w:sz w:val="22"/>
+              </w:rPr>
+              <w:t>Phần mềm CDE CIC (Phân hệ 1 + 2)</w:t>
+            </w:r>
+          </w:p>
+        </w:tc>
+        <w:tc>
+          <w:tcPr>
+            <w:tcW w:type="dxa" w:w="1872"/>
+          </w:tcPr>
+          <w:p>
+            <w:pPr>
+              <w:spacing w:before="20" w:after="20" w:line="276" w:lineRule="auto"/>
+              <w:jc w:val="left"/>
+            </w:pPr>
+            <w:r>
+              <w:rPr>
+                <w:rFonts w:ascii="Times New Roman" w:hAnsi="Times New Roman" w:cs="Times New Roman" w:eastAsia="Times New Roman"/>
+                <w:b w:val="0"/>
+                <w:i w:val="0"/>
+                <w:sz w:val="22"/>
+              </w:rPr>
+              <w:t xml:space="preserve">Giấy phép sử dụng nền tảng CDE CIC bao gồm Phân hệ 1 (Quản lý Tài liệu &amp; Phê duyệt) và Phân hệ 2 (BIM Viewer &amp; Coordination) — </w:t>
+            </w:r>
+            <w:r>
+              <w:rPr>
+                <w:rFonts w:ascii="Times New Roman" w:hAnsi="Times New Roman" w:cs="Times New Roman" w:eastAsia="Times New Roman"/>
+                <w:b/>
+                <w:i w:val="0"/>
+                <w:sz w:val="22"/>
+              </w:rPr>
+              <w:t>không giới hạn số lượng người dùng</w:t>
+            </w:r>
+          </w:p>
+        </w:tc>
+        <w:tc>
+          <w:tcPr>
+            <w:tcW w:type="dxa" w:w="1872"/>
+          </w:tcPr>
+          <w:p>
+            <w:pPr>
+              <w:spacing w:before="20" w:after="20" w:line="276" w:lineRule="auto"/>
+              <w:jc w:val="left"/>
+            </w:pPr>
+            <w:r>
+              <w:rPr>
+                <w:rFonts w:ascii="Times New Roman" w:hAnsi="Times New Roman" w:cs="Times New Roman" w:eastAsia="Times New Roman"/>
+                <w:b/>
+                <w:i w:val="0"/>
+                <w:sz w:val="22"/>
+              </w:rPr>
+              <w:t>150.000.000</w:t>
+            </w:r>
+          </w:p>
+        </w:tc>
+        <w:tc>
+          <w:tcPr>
+            <w:tcW w:type="dxa" w:w="1872"/>
+          </w:tcPr>
+          <w:p>
+            <w:pPr>
+              <w:spacing w:before="20" w:after="20" w:line="276" w:lineRule="auto"/>
+              <w:jc w:val="left"/>
+            </w:pPr>
+            <w:r>
+              <w:rPr>
+                <w:rFonts w:ascii="Times New Roman" w:hAnsi="Times New Roman" w:cs="Times New Roman" w:eastAsia="Times New Roman"/>
+                <w:b w:val="0"/>
+                <w:i w:val="0"/>
+                <w:sz w:val="22"/>
+              </w:rPr>
+              <w:t>Thuê bao 1 năm. Bao gồm triển khai, cấu hình, đào tạo và hỗ trợ kỹ thuật.</w:t>
+            </w:r>
+          </w:p>
+        </w:tc>
+      </w:tr>
+      <w:tr>
+        <w:tc>
+          <w:tcPr>
+            <w:tcW w:type="dxa" w:w="1872"/>
+          </w:tcPr>
+          <w:p>
+            <w:pPr>
+              <w:spacing w:before="20" w:after="20" w:line="276" w:lineRule="auto"/>
+              <w:jc w:val="center"/>
+            </w:pPr>
+          </w:p>
+        </w:tc>
+        <w:tc>
+          <w:tcPr>
+            <w:tcW w:type="dxa" w:w="1872"/>
+          </w:tcPr>
+          <w:p>
+            <w:pPr>
+              <w:spacing w:before="20" w:after="20" w:line="276" w:lineRule="auto"/>
+              <w:jc w:val="left"/>
+            </w:pPr>
+            <w:r>
+              <w:rPr>
+                <w:rFonts w:ascii="Times New Roman" w:hAnsi="Times New Roman" w:cs="Times New Roman" w:eastAsia="Times New Roman"/>
+                <w:b/>
+                <w:i w:val="0"/>
+                <w:sz w:val="22"/>
+              </w:rPr>
+              <w:t>Tổng chi phí phần mềm CDE CIC</w:t>
+            </w:r>
+          </w:p>
+        </w:tc>
+        <w:tc>
+          <w:tcPr>
+            <w:tcW w:type="dxa" w:w="1872"/>
+          </w:tcPr>
+          <w:p>
+            <w:pPr>
+              <w:spacing w:before="20" w:after="20" w:line="276" w:lineRule="auto"/>
+              <w:jc w:val="left"/>
+            </w:pPr>
+          </w:p>
+        </w:tc>
+        <w:tc>
+          <w:tcPr>
+            <w:tcW w:type="dxa" w:w="1872"/>
+          </w:tcPr>
+          <w:p>
+            <w:pPr>
+              <w:spacing w:before="20" w:after="20" w:line="276" w:lineRule="auto"/>
+              <w:jc w:val="left"/>
+            </w:pPr>
+            <w:r>
+              <w:rPr>
+                <w:rFonts w:ascii="Times New Roman" w:hAnsi="Times New Roman" w:cs="Times New Roman" w:eastAsia="Times New Roman"/>
+                <w:b/>
+                <w:i w:val="0"/>
+                <w:sz w:val="22"/>
+              </w:rPr>
+              <w:t>150.000.000</w:t>
+            </w:r>
+          </w:p>
+        </w:tc>
+        <w:tc>
+          <w:tcPr>
+            <w:tcW w:type="dxa" w:w="1872"/>
+          </w:tcPr>
+          <w:p>
+            <w:pPr>
+              <w:spacing w:before="20" w:after="20" w:line="276" w:lineRule="auto"/>
+              <w:jc w:val="left"/>
+            </w:pPr>
+          </w:p>
+        </w:tc>
+      </w:tr>
+    </w:tbl>
+    <w:p>
+      <w:pPr>
+        <w:spacing w:before="40" w:after="40"/>
+        <w:ind w:left="720"/>
+        <w:jc w:val="both"/>
+      </w:pPr>
+      <w:r>
+        <w:rPr>
+          <w:rFonts w:ascii="Times New Roman" w:hAnsi="Times New Roman" w:cs="Times New Roman" w:eastAsia="Times New Roman"/>
+          <w:b w:val="0"/>
+          <w:i/>
+          <w:sz w:val="24"/>
+        </w:rPr>
+        <w:t>Khái toán chi phí hạ tầng Cloud khi nâng cấp (Cho quy mô 100 user và 1 TB lưu trữ SSD):</w:t>
+      </w:r>
+    </w:p>
+    <w:p>
+      <w:pPr>
+        <w:spacing w:before="40" w:after="40" w:lineRule="auto" w:line="276"/>
+        <w:ind w:firstLine="720"/>
+        <w:jc w:val="both"/>
+      </w:pPr>
+      <w:r>
+        <w:rPr>
+          <w:rFonts w:ascii="Times New Roman" w:hAnsi="Times New Roman" w:cs="Times New Roman" w:eastAsia="Times New Roman"/>
+          <w:b w:val="0"/>
+          <w:i w:val="0"/>
+          <w:sz w:val="26"/>
+        </w:rPr>
+        <w:t>&gt;</w:t>
+      </w:r>
+    </w:p>
+    <w:p>
+      <w:pPr>
+        <w:spacing w:before="40" w:after="40"/>
+        <w:ind w:left="720"/>
+        <w:jc w:val="both"/>
+      </w:pPr>
+      <w:r>
+        <w:rPr>
+          <w:rFonts w:ascii="Times New Roman" w:hAnsi="Times New Roman" w:cs="Times New Roman" w:eastAsia="Times New Roman"/>
+          <w:b w:val="0"/>
+          <w:i/>
+          <w:sz w:val="24"/>
+        </w:rPr>
+        <w:t>Để giúp Ban dễ định lượng chi phí tự chi trả khi mở rộng quy mô, dưới đây là khái toán dịch vụ thuê đám mây trong nước (Viettel Cloud / VNPT Cloud đạt chuẩn Tier III) phục vụ cho 100 user truy cập đồng thời và 1 TB dung lượng lưu trữ SSD:</w:t>
+      </w:r>
+    </w:p>
+    <w:p>
+      <w:pPr>
+        <w:spacing w:before="40" w:after="40"/>
+        <w:ind w:left="720"/>
+        <w:jc w:val="both"/>
+      </w:pPr>
+      <w:r>
+        <w:rPr>
+          <w:rFonts w:ascii="Times New Roman" w:hAnsi="Times New Roman" w:cs="Times New Roman" w:eastAsia="Times New Roman"/>
+          <w:b w:val="0"/>
+          <w:i/>
+          <w:sz w:val="24"/>
+        </w:rPr>
+        <w:t>* Máy chủ ảo (Cloud Server - VM): Cấu hình 8 vCPU / 32GB RAM / 100GB SSD hệ thống (vận hành luồng phê duyệt và BIM Viewer Web mượt mà): ~3.000.000 – 4.500.000 VNĐ/tháng.</w:t>
+      </w:r>
+    </w:p>
+    <w:p>
+      <w:pPr>
+        <w:spacing w:before="40" w:after="40"/>
+        <w:ind w:left="720"/>
+        <w:jc w:val="both"/>
+      </w:pPr>
+      <w:r>
+        <w:rPr>
+          <w:rFonts w:ascii="Times New Roman" w:hAnsi="Times New Roman" w:cs="Times New Roman" w:eastAsia="Times New Roman"/>
+          <w:b w:val="0"/>
+          <w:i/>
+          <w:sz w:val="24"/>
+        </w:rPr>
+        <w:t>* Dung lượng lưu trữ SSD/Object Storage (1 TB): Lưu trữ các tệp IFC gốc, bản vẽ và tài liệu dự án: ~800.000 – 1.200.000 VNĐ/tháng.</w:t>
+      </w:r>
+    </w:p>
+    <w:p>
+      <w:pPr>
+        <w:spacing w:before="40" w:after="40"/>
+        <w:ind w:left="720"/>
+        <w:jc w:val="both"/>
+      </w:pPr>
+      <w:r>
+        <w:rPr>
+          <w:rFonts w:ascii="Times New Roman" w:hAnsi="Times New Roman" w:cs="Times New Roman" w:eastAsia="Times New Roman"/>
+          <w:b w:val="0"/>
+          <w:i/>
+          <w:sz w:val="24"/>
+        </w:rPr>
+        <w:t>* Băng thông &amp; Sao lưu (Bandwidth &amp; Backup): Sao lưu tự động hằng ngày và đường truyền mạng trong nước tốc độ cao: ~800.000 – 1.500.000 VNĐ/tháng.</w:t>
+      </w:r>
+    </w:p>
+    <w:p>
+      <w:pPr>
+        <w:spacing w:before="40" w:after="40"/>
+        <w:ind w:left="720"/>
+        <w:jc w:val="both"/>
+      </w:pPr>
+      <w:r>
+        <w:rPr>
+          <w:rFonts w:ascii="Times New Roman" w:hAnsi="Times New Roman" w:cs="Times New Roman" w:eastAsia="Times New Roman"/>
+          <w:b w:val="0"/>
+          <w:i/>
+          <w:sz w:val="24"/>
+        </w:rPr>
+        <w:t>* Tổng chi phí hạ tầng dự kiến: Khoảng 4.600.000 – 7.200.000 VNĐ/tháng (tương đương khoảng 55.000.000 – 86.000.000 VNĐ/năm).</w:t>
+      </w:r>
+    </w:p>
+    <w:p>
+      <w:pPr>
+        <w:spacing w:before="40" w:after="40"/>
+        <w:ind w:left="720"/>
+        <w:jc w:val="both"/>
+      </w:pPr>
+      <w:r>
+        <w:rPr>
+          <w:rFonts w:ascii="Times New Roman" w:hAnsi="Times New Roman" w:cs="Times New Roman" w:eastAsia="Times New Roman"/>
+          <w:b w:val="0"/>
+          <w:i/>
+          <w:sz w:val="24"/>
+        </w:rPr>
+        <w:t>Ưu điểm mô hình chi phí CDE CIC so với CDE nước ngoài:</w:t>
+      </w:r>
+    </w:p>
+    <w:p>
+      <w:pPr>
+        <w:spacing w:before="40" w:after="40" w:lineRule="auto" w:line="276"/>
+        <w:ind w:firstLine="720"/>
+        <w:jc w:val="both"/>
+      </w:pPr>
+      <w:r>
+        <w:rPr>
+          <w:rFonts w:ascii="Times New Roman" w:hAnsi="Times New Roman" w:cs="Times New Roman" w:eastAsia="Times New Roman"/>
+          <w:b w:val="0"/>
+          <w:i w:val="0"/>
+          <w:sz w:val="26"/>
+        </w:rPr>
+        <w:t>&gt;</w:t>
+      </w:r>
+    </w:p>
+    <w:p>
+      <w:pPr>
+        <w:spacing w:before="40" w:after="40"/>
+        <w:ind w:left="720"/>
+        <w:jc w:val="both"/>
+      </w:pPr>
+    </w:p>
+    <w:p>
+      <w:pPr>
+        <w:spacing w:before="40" w:after="40"/>
+        <w:ind w:left="720"/>
+        <w:jc w:val="both"/>
+      </w:pPr>
+    </w:p>
+    <w:p>
+      <w:pPr>
+        <w:spacing w:before="40" w:after="40"/>
+        <w:ind w:left="720"/>
+        <w:jc w:val="both"/>
+      </w:pPr>
+    </w:p>
+    <w:p>
+      <w:pPr>
+        <w:spacing w:before="40" w:after="40"/>
+        <w:ind w:left="720"/>
+        <w:jc w:val="both"/>
+      </w:pPr>
+    </w:p>
+    <w:p>
+      <w:pPr>
+        <w:spacing w:before="40" w:after="40"/>
+        <w:ind w:left="720"/>
+        <w:jc w:val="both"/>
+      </w:pPr>
+    </w:p>
+    <w:p>
+      <w:pPr>
+        <w:spacing w:before="40" w:after="40"/>
+        <w:ind w:left="720"/>
+        <w:jc w:val="both"/>
+      </w:pPr>
+    </w:p>
+    <w:p>
+      <w:pPr>
+        <w:spacing w:before="40" w:after="40"/>
+        <w:ind w:left="720"/>
+        <w:jc w:val="both"/>
+      </w:pPr>
+    </w:p>
+    <w:p>
+      <w:pPr>
+        <w:spacing w:before="40" w:after="40" w:lineRule="auto" w:line="276"/>
+        <w:ind w:firstLine="720"/>
+        <w:jc w:val="both"/>
+      </w:pPr>
+      <w:r>
+        <w:rPr>
+          <w:rFonts w:ascii="Times New Roman" w:hAnsi="Times New Roman" w:cs="Times New Roman" w:eastAsia="Times New Roman"/>
+          <w:b w:val="0"/>
+          <w:i w:val="0"/>
+          <w:sz w:val="26"/>
+        </w:rPr>
+        <w:t>&gt;</w:t>
+      </w:r>
+    </w:p>
+    <w:p>
+      <w:pPr>
+        <w:spacing w:before="40" w:after="40"/>
+        <w:ind w:left="720"/>
+        <w:jc w:val="both"/>
+      </w:pPr>
+      <w:r>
+        <w:rPr>
+          <w:rFonts w:ascii="Times New Roman" w:hAnsi="Times New Roman" w:cs="Times New Roman" w:eastAsia="Times New Roman"/>
+          <w:b w:val="0"/>
+          <w:i/>
+          <w:sz w:val="24"/>
+        </w:rPr>
+        <w:t>Với mô hình không giới hạn user về mặt bản quyền phần mềm, chi phí CDE CIC không tăng khi Ban mở rộng số nhân sự sử dụng (việc mở rộng quy mô phục vụ người dùng sẽ do Ban chủ động nâng cấp hạ tầng Cloud khi cần thiết), trong khi CDE nước ngoài tăng tuyến tính theo số user.</w:t>
+      </w:r>
+    </w:p>
+    <w:p>
+      <w:pPr>
+        <w:spacing w:before="200" w:after="60" w:lineRule="auto" w:line="276"/>
+        <w:jc w:val="left"/>
+      </w:pPr>
+      <w:r>
+        <w:rPr>
+          <w:rFonts w:ascii="Times New Roman" w:hAnsi="Times New Roman" w:cs="Times New Roman" w:eastAsia="Times New Roman"/>
+          <w:b/>
+          <w:i w:val="0"/>
+          <w:sz w:val="26"/>
+        </w:rPr>
+        <w:t>5. Lợi ích khi Ban sử dụng CDE CIC</w:t>
+      </w:r>
+    </w:p>
+    <w:p>
+      <w:pPr>
+        <w:spacing w:before="40" w:after="40"/>
+        <w:ind w:left="360"/>
+        <w:jc w:val="both"/>
+      </w:pPr>
+      <w:r>
+        <w:rPr>
+          <w:rFonts w:ascii="Times New Roman" w:hAnsi="Times New Roman" w:cs="Times New Roman" w:eastAsia="Times New Roman"/>
+          <w:b/>
+          <w:i w:val="0"/>
+          <w:sz w:val="26"/>
+        </w:rPr>
+        <w:t xml:space="preserve">1. </w:t>
+      </w:r>
+      <w:r>
+        <w:rPr>
+          <w:rFonts w:ascii="Times New Roman" w:hAnsi="Times New Roman" w:cs="Times New Roman" w:eastAsia="Times New Roman"/>
+          <w:b/>
+          <w:i w:val="0"/>
+          <w:sz w:val="26"/>
+        </w:rPr>
+        <w:t>Tuân thủ pháp luật:</w:t>
+      </w:r>
+      <w:r>
+        <w:rPr>
+          <w:rFonts w:ascii="Times New Roman" w:hAnsi="Times New Roman" w:cs="Times New Roman" w:eastAsia="Times New Roman"/>
+          <w:b w:val="0"/>
+          <w:i w:val="0"/>
+          <w:sz w:val="26"/>
+        </w:rPr>
+        <w:t xml:space="preserve"> Đáp ứng đầy đủ QCVN 12:2026/BCA — điều kiện tiên quyết để vận hành CDE tại cơ quan nhà nước từ 01/07/2026.</w:t>
+      </w:r>
+    </w:p>
+    <w:p>
+      <w:pPr>
+        <w:spacing w:before="40" w:after="40"/>
+        <w:ind w:left="360"/>
+        <w:jc w:val="both"/>
+      </w:pPr>
+      <w:r>
+        <w:rPr>
+          <w:rFonts w:ascii="Times New Roman" w:hAnsi="Times New Roman" w:cs="Times New Roman" w:eastAsia="Times New Roman"/>
+          <w:b/>
+          <w:i w:val="0"/>
+          <w:sz w:val="26"/>
+        </w:rPr>
+        <w:t xml:space="preserve">2. </w:t>
+      </w:r>
+      <w:r>
+        <w:rPr>
+          <w:rFonts w:ascii="Times New Roman" w:hAnsi="Times New Roman" w:cs="Times New Roman" w:eastAsia="Times New Roman"/>
+          <w:b/>
+          <w:i w:val="0"/>
+          <w:sz w:val="26"/>
+        </w:rPr>
+        <w:t>Tiết kiệm chi phí:</w:t>
+      </w:r>
+      <w:r>
+        <w:rPr>
+          <w:rFonts w:ascii="Times New Roman" w:hAnsi="Times New Roman" w:cs="Times New Roman" w:eastAsia="Times New Roman"/>
+          <w:b w:val="0"/>
+          <w:i w:val="0"/>
+          <w:sz w:val="26"/>
+        </w:rPr>
+        <w:t xml:space="preserve"> Chi phí bản quyền phần mềm CDE nội địa trọn gói theo năm tiết kiệm khoảng 60–80% so với giải pháp CDE nước ngoài tính theo đầu người dùng (user).</w:t>
+      </w:r>
+    </w:p>
+    <w:p>
+      <w:pPr>
+        <w:spacing w:before="40" w:after="40"/>
+        <w:ind w:left="360"/>
+        <w:jc w:val="both"/>
+      </w:pPr>
+      <w:r>
+        <w:rPr>
+          <w:rFonts w:ascii="Times New Roman" w:hAnsi="Times New Roman" w:cs="Times New Roman" w:eastAsia="Times New Roman"/>
+          <w:b/>
+          <w:i w:val="0"/>
+          <w:sz w:val="26"/>
+        </w:rPr>
+        <w:t xml:space="preserve">3. </w:t>
+      </w:r>
+      <w:r>
+        <w:rPr>
+          <w:rFonts w:ascii="Times New Roman" w:hAnsi="Times New Roman" w:cs="Times New Roman" w:eastAsia="Times New Roman"/>
+          <w:b/>
+          <w:i w:val="0"/>
+          <w:sz w:val="26"/>
+        </w:rPr>
+        <w:t>Bảo vệ chủ quyền dữ liệu:</w:t>
+      </w:r>
+      <w:r>
+        <w:rPr>
+          <w:rFonts w:ascii="Times New Roman" w:hAnsi="Times New Roman" w:cs="Times New Roman" w:eastAsia="Times New Roman"/>
+          <w:b w:val="0"/>
+          <w:i w:val="0"/>
+          <w:sz w:val="26"/>
+        </w:rPr>
+        <w:t xml:space="preserve"> Toàn bộ hồ sơ thiết kế, bản vẽ hoàn công, mô hình BIM được lưu trữ trên máy chủ trong lãnh thổ Việt Nam.</w:t>
+      </w:r>
+    </w:p>
+    <w:p>
+      <w:pPr>
+        <w:spacing w:before="40" w:after="40"/>
+        <w:ind w:left="360"/>
+        <w:jc w:val="both"/>
+      </w:pPr>
+      <w:r>
+        <w:rPr>
+          <w:rFonts w:ascii="Times New Roman" w:hAnsi="Times New Roman" w:cs="Times New Roman" w:eastAsia="Times New Roman"/>
+          <w:b/>
+          <w:i w:val="0"/>
+          <w:sz w:val="26"/>
+        </w:rPr>
+        <w:t xml:space="preserve">4. </w:t>
+      </w:r>
+      <w:r>
+        <w:rPr>
+          <w:rFonts w:ascii="Times New Roman" w:hAnsi="Times New Roman" w:cs="Times New Roman" w:eastAsia="Times New Roman"/>
+          <w:b/>
+          <w:i w:val="0"/>
+          <w:sz w:val="26"/>
+        </w:rPr>
+        <w:t>Bản địa hóa nghiệp vụ:</w:t>
+      </w:r>
+      <w:r>
+        <w:rPr>
+          <w:rFonts w:ascii="Times New Roman" w:hAnsi="Times New Roman" w:cs="Times New Roman" w:eastAsia="Times New Roman"/>
+          <w:b w:val="0"/>
+          <w:i w:val="0"/>
+          <w:sz w:val="26"/>
+        </w:rPr>
+        <w:t xml:space="preserve"> Giao diện tiếng Việt, quy trình phê duyệt phù hợp thực tiễn Ban QLDA, tích hợp sẵn biểu mẫu BEP/EIR đang áp dụng tại Việt Nam.</w:t>
+      </w:r>
+    </w:p>
+    <w:p>
+      <w:pPr>
+        <w:spacing w:before="40" w:after="40"/>
+        <w:ind w:left="360"/>
+        <w:jc w:val="both"/>
+      </w:pPr>
+      <w:r>
+        <w:rPr>
+          <w:rFonts w:ascii="Times New Roman" w:hAnsi="Times New Roman" w:cs="Times New Roman" w:eastAsia="Times New Roman"/>
+          <w:b/>
+          <w:i w:val="0"/>
+          <w:sz w:val="26"/>
+        </w:rPr>
+        <w:t xml:space="preserve">5. </w:t>
+      </w:r>
+      <w:r>
+        <w:rPr>
+          <w:rFonts w:ascii="Times New Roman" w:hAnsi="Times New Roman" w:cs="Times New Roman" w:eastAsia="Times New Roman"/>
+          <w:b/>
+          <w:i w:val="0"/>
+          <w:sz w:val="26"/>
+        </w:rPr>
+        <w:t>Hỗ trợ kỹ thuật trực tiếp:</w:t>
+      </w:r>
+      <w:r>
+        <w:rPr>
+          <w:rFonts w:ascii="Times New Roman" w:hAnsi="Times New Roman" w:cs="Times New Roman" w:eastAsia="Times New Roman"/>
+          <w:b w:val="0"/>
+          <w:i w:val="0"/>
+          <w:sz w:val="26"/>
+        </w:rPr>
+        <w:t xml:space="preserve"> Đội ngũ CIC hỗ trợ tại chỗ, đào tạo trực tiếp, giải quyết vấn đề nhanh chóng — không phụ thuộc vào support quốc tế múi giờ khác.</w:t>
+      </w:r>
+    </w:p>
+    <w:p>
+      <w:pPr>
+        <w:spacing w:before="40" w:after="40"/>
+        <w:ind w:left="360"/>
+        <w:jc w:val="both"/>
+      </w:pPr>
+      <w:r>
+        <w:rPr>
+          <w:rFonts w:ascii="Times New Roman" w:hAnsi="Times New Roman" w:cs="Times New Roman" w:eastAsia="Times New Roman"/>
+          <w:b/>
+          <w:i w:val="0"/>
+          <w:sz w:val="26"/>
+        </w:rPr>
+        <w:t xml:space="preserve">6. </w:t>
+      </w:r>
+      <w:r>
+        <w:rPr>
+          <w:rFonts w:ascii="Times New Roman" w:hAnsi="Times New Roman" w:cs="Times New Roman" w:eastAsia="Times New Roman"/>
+          <w:b/>
+          <w:i w:val="0"/>
+          <w:sz w:val="26"/>
+        </w:rPr>
+        <w:t>Ưu tiên mua sắm công:</w:t>
+      </w:r>
+      <w:r>
+        <w:rPr>
+          <w:rFonts w:ascii="Times New Roman" w:hAnsi="Times New Roman" w:cs="Times New Roman" w:eastAsia="Times New Roman"/>
+          <w:b w:val="0"/>
+          <w:i w:val="0"/>
+          <w:sz w:val="26"/>
+        </w:rPr>
+        <w:t xml:space="preserve"> CDE CIC hướng tới chứng nhận "Sản phẩm công nghệ số trọng điểm" theo TT 31/2025/TT-BKHCN, được ưu tiên khi sử dụng vốn ngân sách nhà nước (Điều 31 Luật Công nghiệp Công nghệ số).</w:t>
+      </w:r>
+    </w:p>
+    <w:p>
+      <w:pPr>
+        <w:spacing w:before="280" w:after="80" w:lineRule="auto" w:line="276"/>
+        <w:jc w:val="left"/>
+      </w:pPr>
+      <w:r>
+        <w:rPr>
+          <w:rFonts w:ascii="Times New Roman" w:hAnsi="Times New Roman" w:cs="Times New Roman" w:eastAsia="Times New Roman"/>
+          <w:b/>
+          <w:i w:val="0"/>
+          <w:sz w:val="26"/>
+        </w:rPr>
+        <w:t>VI. CHI PHÍ KHÁI TOÁN SƠ BỘ TỔNG HỢP</w:t>
+      </w:r>
+    </w:p>
+    <w:tbl>
+      <w:tblPr>
+        <w:tblW w:type="auto" w:w="0"/>
+        <w:jc w:val="center"/>
+        <w:tblLayout w:type="autofit"/>
+        <w:tblLook w:firstColumn="1" w:firstRow="1" w:lastColumn="0" w:lastRow="0" w:noHBand="0" w:noVBand="1" w:val="04A0"/>
+        <w:tblBorders>
+          <w:top w:val="single" w:sz="4" w:space="0" w:color="000000"/>
+          <w:left w:val="single" w:sz="4" w:space="0" w:color="000000"/>
+          <w:bottom w:val="single" w:sz="4" w:space="0" w:color="000000"/>
+          <w:right w:val="single" w:sz="4" w:space="0" w:color="000000"/>
+          <w:insideH w:val="single" w:sz="4" w:space="0" w:color="000000"/>
+          <w:insideV w:val="single" w:sz="4" w:space="0" w:color="000000"/>
+        </w:tblBorders>
+      </w:tblPr>
+      <w:tblGrid>
+        <w:gridCol w:w="1872"/>
+        <w:gridCol w:w="1872"/>
+        <w:gridCol w:w="1872"/>
+        <w:gridCol w:w="1872"/>
+        <w:gridCol w:w="1872"/>
+      </w:tblGrid>
+      <w:tr>
+        <w:tc>
+          <w:tcPr>
+            <w:tcW w:type="dxa" w:w="1872"/>
+          </w:tcPr>
+          <w:p>
+            <w:pPr>
+              <w:spacing w:before="20" w:after="20" w:line="276" w:lineRule="auto"/>
+              <w:jc w:val="center"/>
+            </w:pPr>
+            <w:r>
+              <w:rPr>
+                <w:rFonts w:ascii="Times New Roman" w:hAnsi="Times New Roman" w:cs="Times New Roman" w:eastAsia="Times New Roman"/>
+                <w:b/>
+                <w:i w:val="0"/>
+                <w:sz w:val="22"/>
+              </w:rPr>
+              <w:t>STT</w:t>
+            </w:r>
+          </w:p>
+        </w:tc>
+        <w:tc>
+          <w:tcPr>
+            <w:tcW w:type="dxa" w:w="1872"/>
+          </w:tcPr>
+          <w:p>
+            <w:pPr>
+              <w:spacing w:before="20" w:after="20" w:line="276" w:lineRule="auto"/>
+              <w:jc w:val="center"/>
+            </w:pPr>
+            <w:r>
+              <w:rPr>
+                <w:rFonts w:ascii="Times New Roman" w:hAnsi="Times New Roman" w:cs="Times New Roman" w:eastAsia="Times New Roman"/>
+                <w:b/>
+                <w:i w:val="0"/>
+                <w:sz w:val="22"/>
+              </w:rPr>
+              <w:t>Nội dung</w:t>
+            </w:r>
+          </w:p>
+        </w:tc>
+        <w:tc>
+          <w:tcPr>
+            <w:tcW w:type="dxa" w:w="1872"/>
+          </w:tcPr>
+          <w:p>
+            <w:pPr>
+              <w:spacing w:before="20" w:after="20" w:line="276" w:lineRule="auto"/>
+              <w:jc w:val="center"/>
+            </w:pPr>
+            <w:r>
+              <w:rPr>
+                <w:rFonts w:ascii="Times New Roman" w:hAnsi="Times New Roman" w:cs="Times New Roman" w:eastAsia="Times New Roman"/>
+                <w:b/>
+                <w:i w:val="0"/>
+                <w:sz w:val="22"/>
+              </w:rPr>
+              <w:t>Giá trị (VNĐ)</w:t>
+            </w:r>
+          </w:p>
+        </w:tc>
+        <w:tc>
+          <w:tcPr>
+            <w:tcW w:type="dxa" w:w="1872"/>
+          </w:tcPr>
+          <w:p>
+            <w:pPr>
+              <w:spacing w:before="20" w:after="20" w:line="276" w:lineRule="auto"/>
+              <w:jc w:val="center"/>
+            </w:pPr>
+            <w:r>
+              <w:rPr>
+                <w:rFonts w:ascii="Times New Roman" w:hAnsi="Times New Roman" w:cs="Times New Roman" w:eastAsia="Times New Roman"/>
+                <w:b/>
+                <w:i w:val="0"/>
+                <w:sz w:val="22"/>
+              </w:rPr>
+              <w:t>Số lượng</w:t>
+            </w:r>
+          </w:p>
+        </w:tc>
+        <w:tc>
+          <w:tcPr>
+            <w:tcW w:type="dxa" w:w="1872"/>
+          </w:tcPr>
+          <w:p>
+            <w:pPr>
+              <w:spacing w:before="20" w:after="20" w:line="276" w:lineRule="auto"/>
+              <w:jc w:val="center"/>
+            </w:pPr>
+            <w:r>
+              <w:rPr>
+                <w:rFonts w:ascii="Times New Roman" w:hAnsi="Times New Roman" w:cs="Times New Roman" w:eastAsia="Times New Roman"/>
+                <w:b/>
+                <w:i w:val="0"/>
+                <w:sz w:val="22"/>
+              </w:rPr>
+              <w:t>Tổng hợp (VNĐ)</w:t>
+            </w:r>
+          </w:p>
+        </w:tc>
+      </w:tr>
+      <w:tr>
+        <w:tc>
+          <w:tcPr>
+            <w:tcW w:type="dxa" w:w="1872"/>
+          </w:tcPr>
+          <w:p>
+            <w:pPr>
+              <w:spacing w:before="20" w:after="20" w:line="276" w:lineRule="auto"/>
+              <w:jc w:val="center"/>
+            </w:pPr>
+            <w:r>
+              <w:rPr>
+                <w:rFonts w:ascii="Times New Roman" w:hAnsi="Times New Roman" w:cs="Times New Roman" w:eastAsia="Times New Roman"/>
+                <w:b w:val="0"/>
+                <w:i w:val="0"/>
+                <w:sz w:val="22"/>
+              </w:rPr>
+              <w:t>1</w:t>
+            </w:r>
+          </w:p>
+        </w:tc>
+        <w:tc>
+          <w:tcPr>
+            <w:tcW w:type="dxa" w:w="1872"/>
+          </w:tcPr>
+          <w:p>
+            <w:pPr>
+              <w:spacing w:before="20" w:after="20" w:line="276" w:lineRule="auto"/>
+              <w:jc w:val="left"/>
+            </w:pPr>
+            <w:r>
+              <w:rPr>
+                <w:rFonts w:ascii="Times New Roman" w:hAnsi="Times New Roman" w:cs="Times New Roman" w:eastAsia="Times New Roman"/>
+                <w:b w:val="0"/>
+                <w:i w:val="0"/>
+                <w:sz w:val="22"/>
+              </w:rPr>
+              <w:t>Máy tính</w:t>
+            </w:r>
+          </w:p>
+        </w:tc>
+        <w:tc>
+          <w:tcPr>
+            <w:tcW w:type="dxa" w:w="1872"/>
+          </w:tcPr>
+          <w:p>
+            <w:pPr>
+              <w:spacing w:before="20" w:after="20" w:line="276" w:lineRule="auto"/>
+              <w:jc w:val="center"/>
+            </w:pPr>
+            <w:r>
+              <w:rPr>
+                <w:rFonts w:ascii="Times New Roman" w:hAnsi="Times New Roman" w:cs="Times New Roman" w:eastAsia="Times New Roman"/>
+                <w:b w:val="0"/>
+                <w:i w:val="0"/>
+                <w:sz w:val="22"/>
+              </w:rPr>
+              <w:t>70.000.000</w:t>
+            </w:r>
+          </w:p>
+        </w:tc>
+        <w:tc>
+          <w:tcPr>
+            <w:tcW w:type="dxa" w:w="1872"/>
+          </w:tcPr>
+          <w:p>
+            <w:pPr>
+              <w:spacing w:before="20" w:after="20" w:line="276" w:lineRule="auto"/>
+              <w:jc w:val="center"/>
+            </w:pPr>
+            <w:r>
+              <w:rPr>
+                <w:rFonts w:ascii="Times New Roman" w:hAnsi="Times New Roman" w:cs="Times New Roman" w:eastAsia="Times New Roman"/>
+                <w:b w:val="0"/>
+                <w:i w:val="0"/>
+                <w:sz w:val="22"/>
+              </w:rPr>
+              <w:t>10</w:t>
+            </w:r>
+          </w:p>
+        </w:tc>
+        <w:tc>
+          <w:tcPr>
+            <w:tcW w:type="dxa" w:w="1872"/>
+          </w:tcPr>
+          <w:p>
+            <w:pPr>
+              <w:spacing w:before="20" w:after="20" w:line="276" w:lineRule="auto"/>
+              <w:jc w:val="center"/>
+            </w:pPr>
+            <w:r>
+              <w:rPr>
+                <w:rFonts w:ascii="Times New Roman" w:hAnsi="Times New Roman" w:cs="Times New Roman" w:eastAsia="Times New Roman"/>
+                <w:b w:val="0"/>
+                <w:i w:val="0"/>
+                <w:sz w:val="22"/>
+              </w:rPr>
+              <w:t>700.000.000</w:t>
+            </w:r>
+          </w:p>
+        </w:tc>
+      </w:tr>
+      <w:tr>
+        <w:tc>
+          <w:tcPr>
+            <w:tcW w:type="dxa" w:w="1872"/>
+          </w:tcPr>
+          <w:p>
+            <w:pPr>
+              <w:spacing w:before="20" w:after="20" w:line="276" w:lineRule="auto"/>
+              <w:jc w:val="center"/>
+            </w:pPr>
+            <w:r>
+              <w:rPr>
+                <w:rFonts w:ascii="Times New Roman" w:hAnsi="Times New Roman" w:cs="Times New Roman" w:eastAsia="Times New Roman"/>
+                <w:b w:val="0"/>
+                <w:i w:val="0"/>
+                <w:sz w:val="22"/>
+              </w:rPr>
+              <w:t>2</w:t>
+            </w:r>
+          </w:p>
+        </w:tc>
+        <w:tc>
+          <w:tcPr>
+            <w:tcW w:type="dxa" w:w="1872"/>
+          </w:tcPr>
+          <w:p>
+            <w:pPr>
+              <w:spacing w:before="20" w:after="20" w:line="276" w:lineRule="auto"/>
+              <w:jc w:val="left"/>
+            </w:pPr>
+            <w:r>
+              <w:rPr>
+                <w:rFonts w:ascii="Times New Roman" w:hAnsi="Times New Roman" w:cs="Times New Roman" w:eastAsia="Times New Roman"/>
+                <w:b w:val="0"/>
+                <w:i w:val="0"/>
+                <w:sz w:val="22"/>
+              </w:rPr>
+              <w:t>Phần mềm Autodesk AEC Collection (thuê bao 1 năm)</w:t>
+            </w:r>
+          </w:p>
+        </w:tc>
+        <w:tc>
+          <w:tcPr>
+            <w:tcW w:type="dxa" w:w="1872"/>
+          </w:tcPr>
+          <w:p>
+            <w:pPr>
+              <w:spacing w:before="20" w:after="20" w:line="276" w:lineRule="auto"/>
+              <w:jc w:val="center"/>
+            </w:pPr>
+            <w:r>
+              <w:rPr>
+                <w:rFonts w:ascii="Times New Roman" w:hAnsi="Times New Roman" w:cs="Times New Roman" w:eastAsia="Times New Roman"/>
+                <w:b w:val="0"/>
+                <w:i w:val="0"/>
+                <w:sz w:val="22"/>
+              </w:rPr>
+              <w:t>73.500.000</w:t>
+            </w:r>
+          </w:p>
+        </w:tc>
+        <w:tc>
+          <w:tcPr>
+            <w:tcW w:type="dxa" w:w="1872"/>
+          </w:tcPr>
+          <w:p>
+            <w:pPr>
+              <w:spacing w:before="20" w:after="20" w:line="276" w:lineRule="auto"/>
+              <w:jc w:val="center"/>
+            </w:pPr>
+            <w:r>
+              <w:rPr>
+                <w:rFonts w:ascii="Times New Roman" w:hAnsi="Times New Roman" w:cs="Times New Roman" w:eastAsia="Times New Roman"/>
+                <w:b w:val="0"/>
+                <w:i w:val="0"/>
+                <w:sz w:val="22"/>
+              </w:rPr>
+              <w:t>10</w:t>
+            </w:r>
+          </w:p>
+        </w:tc>
+        <w:tc>
+          <w:tcPr>
+            <w:tcW w:type="dxa" w:w="1872"/>
+          </w:tcPr>
+          <w:p>
+            <w:pPr>
+              <w:spacing w:before="20" w:after="20" w:line="276" w:lineRule="auto"/>
+              <w:jc w:val="center"/>
+            </w:pPr>
+            <w:r>
+              <w:rPr>
+                <w:rFonts w:ascii="Times New Roman" w:hAnsi="Times New Roman" w:cs="Times New Roman" w:eastAsia="Times New Roman"/>
+                <w:b w:val="0"/>
+                <w:i w:val="0"/>
+                <w:sz w:val="22"/>
+              </w:rPr>
+              <w:t>730.500.000</w:t>
+            </w:r>
+          </w:p>
+        </w:tc>
+      </w:tr>
+      <w:tr>
+        <w:tc>
+          <w:tcPr>
+            <w:tcW w:type="dxa" w:w="1872"/>
+          </w:tcPr>
+          <w:p>
+            <w:pPr>
+              <w:spacing w:before="20" w:after="20" w:line="276" w:lineRule="auto"/>
+              <w:jc w:val="center"/>
+            </w:pPr>
+            <w:r>
+              <w:rPr>
+                <w:rFonts w:ascii="Times New Roman" w:hAnsi="Times New Roman" w:cs="Times New Roman" w:eastAsia="Times New Roman"/>
+                <w:b w:val="0"/>
+                <w:i w:val="0"/>
+                <w:sz w:val="22"/>
+              </w:rPr>
+              <w:t>3</w:t>
+            </w:r>
+          </w:p>
+        </w:tc>
+        <w:tc>
+          <w:tcPr>
+            <w:tcW w:type="dxa" w:w="1872"/>
+          </w:tcPr>
+          <w:p>
+            <w:pPr>
+              <w:spacing w:before="20" w:after="20" w:line="276" w:lineRule="auto"/>
+              <w:jc w:val="left"/>
+            </w:pPr>
+            <w:r>
+              <w:rPr>
+                <w:rFonts w:ascii="Times New Roman" w:hAnsi="Times New Roman" w:cs="Times New Roman" w:eastAsia="Times New Roman"/>
+                <w:b w:val="0"/>
+                <w:i w:val="0"/>
+                <w:sz w:val="22"/>
+              </w:rPr>
+              <w:t>Phần mềm CDE CIC — Phân hệ 1 + 2 (thuê bao 1 năm, không giới hạn user)</w:t>
+            </w:r>
+          </w:p>
+        </w:tc>
+        <w:tc>
+          <w:tcPr>
+            <w:tcW w:type="dxa" w:w="1872"/>
+          </w:tcPr>
+          <w:p>
+            <w:pPr>
+              <w:spacing w:before="20" w:after="20" w:line="276" w:lineRule="auto"/>
+              <w:jc w:val="center"/>
+            </w:pPr>
+            <w:r>
+              <w:rPr>
+                <w:rFonts w:ascii="Times New Roman" w:hAnsi="Times New Roman" w:cs="Times New Roman" w:eastAsia="Times New Roman"/>
+                <w:b w:val="0"/>
+                <w:i w:val="0"/>
+                <w:sz w:val="22"/>
+              </w:rPr>
+              <w:t>150.000.000</w:t>
+            </w:r>
+          </w:p>
+        </w:tc>
+        <w:tc>
+          <w:tcPr>
+            <w:tcW w:type="dxa" w:w="1872"/>
+          </w:tcPr>
+          <w:p>
+            <w:pPr>
+              <w:spacing w:before="20" w:after="20" w:line="276" w:lineRule="auto"/>
+              <w:jc w:val="left"/>
+            </w:pPr>
+            <w:r>
+              <w:rPr>
+                <w:rFonts w:ascii="Times New Roman" w:hAnsi="Times New Roman" w:cs="Times New Roman" w:eastAsia="Times New Roman"/>
+                <w:b w:val="0"/>
+                <w:i w:val="0"/>
+                <w:sz w:val="22"/>
+              </w:rPr>
+              <w:t>1 gói</w:t>
+            </w:r>
+          </w:p>
+        </w:tc>
+        <w:tc>
+          <w:tcPr>
+            <w:tcW w:type="dxa" w:w="1872"/>
+          </w:tcPr>
+          <w:p>
+            <w:pPr>
+              <w:spacing w:before="20" w:after="20" w:line="276" w:lineRule="auto"/>
+              <w:jc w:val="center"/>
+            </w:pPr>
+            <w:r>
+              <w:rPr>
+                <w:rFonts w:ascii="Times New Roman" w:hAnsi="Times New Roman" w:cs="Times New Roman" w:eastAsia="Times New Roman"/>
+                <w:b w:val="0"/>
+                <w:i w:val="0"/>
+                <w:sz w:val="22"/>
+              </w:rPr>
+              <w:t>150.000.000</w:t>
+            </w:r>
+          </w:p>
+        </w:tc>
+      </w:tr>
+      <w:tr>
+        <w:tc>
+          <w:tcPr>
+            <w:tcW w:type="dxa" w:w="1872"/>
+          </w:tcPr>
+          <w:p>
+            <w:pPr>
+              <w:spacing w:before="20" w:after="20" w:line="276" w:lineRule="auto"/>
+              <w:jc w:val="center"/>
+            </w:pPr>
+            <w:r>
+              <w:rPr>
+                <w:rFonts w:ascii="Times New Roman" w:hAnsi="Times New Roman" w:cs="Times New Roman" w:eastAsia="Times New Roman"/>
+                <w:b w:val="0"/>
+                <w:i w:val="0"/>
+                <w:sz w:val="22"/>
+              </w:rPr>
+              <w:t>4</w:t>
+            </w:r>
+          </w:p>
+        </w:tc>
+        <w:tc>
+          <w:tcPr>
+            <w:tcW w:type="dxa" w:w="1872"/>
+          </w:tcPr>
+          <w:p>
+            <w:pPr>
+              <w:spacing w:before="20" w:after="20" w:line="276" w:lineRule="auto"/>
+              <w:jc w:val="left"/>
+            </w:pPr>
+            <w:r>
+              <w:rPr>
+                <w:rFonts w:ascii="Times New Roman" w:hAnsi="Times New Roman" w:cs="Times New Roman" w:eastAsia="Times New Roman"/>
+                <w:b w:val="0"/>
+                <w:i w:val="0"/>
+                <w:sz w:val="22"/>
+              </w:rPr>
+              <w:t>Hạ tầng Cloud CDE (Viettel Cloud / VNPT, thuê bao 1 năm)</w:t>
+            </w:r>
+          </w:p>
+        </w:tc>
+        <w:tc>
+          <w:tcPr>
+            <w:tcW w:type="dxa" w:w="1872"/>
+          </w:tcPr>
+          <w:p>
+            <w:pPr>
+              <w:spacing w:before="20" w:after="20" w:line="276" w:lineRule="auto"/>
+              <w:jc w:val="left"/>
+            </w:pPr>
+            <w:r>
+              <w:rPr>
+                <w:rFonts w:ascii="Times New Roman" w:hAnsi="Times New Roman" w:cs="Times New Roman" w:eastAsia="Times New Roman"/>
+                <w:b w:val="0"/>
+                <w:i/>
+                <w:sz w:val="22"/>
+              </w:rPr>
+              <w:t>(Theo nhà cung cấp)</w:t>
+            </w:r>
+          </w:p>
+        </w:tc>
+        <w:tc>
+          <w:tcPr>
+            <w:tcW w:type="dxa" w:w="1872"/>
+          </w:tcPr>
+          <w:p>
+            <w:pPr>
+              <w:spacing w:before="20" w:after="20" w:line="276" w:lineRule="auto"/>
+              <w:jc w:val="left"/>
+            </w:pPr>
+            <w:r>
+              <w:rPr>
+                <w:rFonts w:ascii="Times New Roman" w:hAnsi="Times New Roman" w:cs="Times New Roman" w:eastAsia="Times New Roman"/>
+                <w:b w:val="0"/>
+                <w:i w:val="0"/>
+                <w:sz w:val="22"/>
+              </w:rPr>
+              <w:t>1 gói</w:t>
+            </w:r>
+          </w:p>
+        </w:tc>
+        <w:tc>
+          <w:tcPr>
+            <w:tcW w:type="dxa" w:w="1872"/>
+          </w:tcPr>
+          <w:p>
+            <w:pPr>
+              <w:spacing w:before="20" w:after="20" w:line="276" w:lineRule="auto"/>
+              <w:jc w:val="center"/>
+            </w:pPr>
+            <w:r>
+              <w:rPr>
+                <w:rFonts w:ascii="Times New Roman" w:hAnsi="Times New Roman" w:cs="Times New Roman" w:eastAsia="Times New Roman"/>
+                <w:b w:val="0"/>
+                <w:i/>
+                <w:sz w:val="22"/>
+              </w:rPr>
+              <w:t>(Dự kiến 50–100 triệu)</w:t>
+            </w:r>
+          </w:p>
+        </w:tc>
+      </w:tr>
+      <w:tr>
+        <w:tc>
+          <w:tcPr>
+            <w:tcW w:type="dxa" w:w="1872"/>
+          </w:tcPr>
+          <w:p>
+            <w:pPr>
+              <w:spacing w:before="20" w:after="20" w:line="276" w:lineRule="auto"/>
+              <w:jc w:val="center"/>
+            </w:pPr>
+          </w:p>
+        </w:tc>
+        <w:tc>
+          <w:tcPr>
+            <w:tcW w:type="dxa" w:w="1872"/>
+          </w:tcPr>
+          <w:p>
+            <w:pPr>
+              <w:spacing w:before="20" w:after="20" w:line="276" w:lineRule="auto"/>
+              <w:jc w:val="left"/>
+            </w:pPr>
+            <w:r>
+              <w:rPr>
+                <w:rFonts w:ascii="Times New Roman" w:hAnsi="Times New Roman" w:cs="Times New Roman" w:eastAsia="Times New Roman"/>
+                <w:b/>
+                <w:i w:val="0"/>
+                <w:sz w:val="22"/>
+              </w:rPr>
+              <w:t>Tổng (chưa bao gồm hạ tầng Cloud)</w:t>
+            </w:r>
+          </w:p>
+        </w:tc>
+        <w:tc>
+          <w:tcPr>
+            <w:tcW w:type="dxa" w:w="1872"/>
+          </w:tcPr>
+          <w:p>
+            <w:pPr>
+              <w:spacing w:before="20" w:after="20" w:line="276" w:lineRule="auto"/>
+              <w:jc w:val="left"/>
+            </w:pPr>
+          </w:p>
+        </w:tc>
+        <w:tc>
+          <w:tcPr>
+            <w:tcW w:type="dxa" w:w="1872"/>
+          </w:tcPr>
+          <w:p>
+            <w:pPr>
+              <w:spacing w:before="20" w:after="20" w:line="276" w:lineRule="auto"/>
+              <w:jc w:val="left"/>
+            </w:pPr>
+          </w:p>
+        </w:tc>
+        <w:tc>
+          <w:tcPr>
+            <w:tcW w:type="dxa" w:w="1872"/>
+          </w:tcPr>
+          <w:p>
+            <w:pPr>
+              <w:spacing w:before="20" w:after="20" w:line="276" w:lineRule="auto"/>
+              <w:jc w:val="left"/>
+            </w:pPr>
+            <w:r>
+              <w:rPr>
+                <w:rFonts w:ascii="Times New Roman" w:hAnsi="Times New Roman" w:cs="Times New Roman" w:eastAsia="Times New Roman"/>
+                <w:b/>
+                <w:i w:val="0"/>
+                <w:sz w:val="22"/>
+              </w:rPr>
+              <w:t>1.580.500.000</w:t>
+            </w:r>
+          </w:p>
+        </w:tc>
+      </w:tr>
+      <w:tr>
+        <w:tc>
+          <w:tcPr>
+            <w:tcW w:type="dxa" w:w="1872"/>
+          </w:tcPr>
+          <w:p>
+            <w:pPr>
+              <w:spacing w:before="20" w:after="20" w:line="276" w:lineRule="auto"/>
+              <w:jc w:val="center"/>
+            </w:pPr>
+          </w:p>
+        </w:tc>
+        <w:tc>
+          <w:tcPr>
+            <w:tcW w:type="dxa" w:w="1872"/>
+          </w:tcPr>
+          <w:p>
+            <w:pPr>
+              <w:spacing w:before="20" w:after="20" w:line="276" w:lineRule="auto"/>
+              <w:jc w:val="left"/>
+            </w:pPr>
+            <w:r>
+              <w:rPr>
+                <w:rFonts w:ascii="Times New Roman" w:hAnsi="Times New Roman" w:cs="Times New Roman" w:eastAsia="Times New Roman"/>
+                <w:b/>
+                <w:i w:val="0"/>
+                <w:sz w:val="22"/>
+              </w:rPr>
+              <w:t>Tổng dự kiến (bao gồm hạ tầng Cloud)</w:t>
+            </w:r>
+          </w:p>
+        </w:tc>
+        <w:tc>
+          <w:tcPr>
+            <w:tcW w:type="dxa" w:w="1872"/>
+          </w:tcPr>
+          <w:p>
+            <w:pPr>
+              <w:spacing w:before="20" w:after="20" w:line="276" w:lineRule="auto"/>
+              <w:jc w:val="left"/>
+            </w:pPr>
+          </w:p>
+        </w:tc>
+        <w:tc>
+          <w:tcPr>
+            <w:tcW w:type="dxa" w:w="1872"/>
+          </w:tcPr>
+          <w:p>
+            <w:pPr>
+              <w:spacing w:before="20" w:after="20" w:line="276" w:lineRule="auto"/>
+              <w:jc w:val="left"/>
+            </w:pPr>
+          </w:p>
+        </w:tc>
+        <w:tc>
+          <w:tcPr>
+            <w:tcW w:type="dxa" w:w="1872"/>
+          </w:tcPr>
+          <w:p>
+            <w:pPr>
+              <w:spacing w:before="20" w:after="20" w:line="276" w:lineRule="auto"/>
+              <w:jc w:val="left"/>
+            </w:pPr>
+            <w:r>
+              <w:rPr>
+                <w:rFonts w:ascii="Times New Roman" w:hAnsi="Times New Roman" w:cs="Times New Roman" w:eastAsia="Times New Roman"/>
+                <w:b/>
+                <w:i w:val="0"/>
+                <w:sz w:val="22"/>
+              </w:rPr>
+              <w:t>~1.630.500.000 – 1.680.500.000</w:t>
+            </w:r>
+          </w:p>
+        </w:tc>
+      </w:tr>
+    </w:tbl>
+    <w:p>
+      <w:pPr>
+        <w:spacing w:before="40" w:after="40"/>
+        <w:ind w:left="720"/>
+        <w:jc w:val="both"/>
+      </w:pPr>
+      <w:r>
+        <w:rPr>
+          <w:rFonts w:ascii="Times New Roman" w:hAnsi="Times New Roman" w:cs="Times New Roman" w:eastAsia="Times New Roman"/>
+          <w:b w:val="0"/>
+          <w:i/>
+          <w:sz w:val="24"/>
+        </w:rPr>
+        <w:t>Kiến nghị: Ban Giám đốc xem xét, phê duyệt phương án triển khai đồng bộ:</w:t>
+      </w:r>
+    </w:p>
+    <w:p>
+      <w:pPr>
+        <w:spacing w:before="40" w:after="40"/>
+        <w:ind w:left="720"/>
+        <w:jc w:val="both"/>
+      </w:pPr>
+      <w:r>
+        <w:rPr>
+          <w:rFonts w:ascii="Times New Roman" w:hAnsi="Times New Roman" w:cs="Times New Roman" w:eastAsia="Times New Roman"/>
+          <w:b w:val="0"/>
+          <w:i/>
+          <w:sz w:val="24"/>
+        </w:rPr>
+        <w:t>1. Phần cứng: 10 máy tính cấu hình BIM.</w:t>
+      </w:r>
+    </w:p>
+    <w:p>
+      <w:pPr>
+        <w:spacing w:before="40" w:after="40"/>
+        <w:ind w:left="720"/>
+        <w:jc w:val="both"/>
+      </w:pPr>
+      <w:r>
+        <w:rPr>
+          <w:rFonts w:ascii="Times New Roman" w:hAnsi="Times New Roman" w:cs="Times New Roman" w:eastAsia="Times New Roman"/>
+          <w:b w:val="0"/>
+          <w:i/>
+          <w:sz w:val="24"/>
+        </w:rPr>
+        <w:t>2. Phần mềm tạo lập mô hình: 10 license Autodesk AEC Collection.</w:t>
+      </w:r>
+    </w:p>
+    <w:p>
+      <w:pPr>
+        <w:spacing w:before="40" w:after="40"/>
+        <w:ind w:left="720"/>
+        <w:jc w:val="both"/>
+      </w:pPr>
+      <w:r>
+        <w:rPr>
+          <w:rFonts w:ascii="Times New Roman" w:hAnsi="Times New Roman" w:cs="Times New Roman" w:eastAsia="Times New Roman"/>
+          <w:b w:val="0"/>
+          <w:i/>
+          <w:sz w:val="24"/>
+        </w:rPr>
+        <w:t>3. Nền tảng CDE CIC (Phân hệ 1 + 2): Bản quyền phần mềm quản lý tài liệu và BIM Viewer — không giới hạn user, đáp ứng QCVN 12:2026/BCA (việc mở rộng số lượng user sẽ do Ban chủ động nâng cấp hạ tầng Cloud khi cần thiết).</w:t>
+      </w:r>
+    </w:p>
+    <w:p>
+      <w:pPr>
+        <w:spacing w:before="40" w:after="40"/>
+        <w:ind w:left="720"/>
+        <w:jc w:val="both"/>
+      </w:pPr>
+      <w:r>
+        <w:rPr>
+          <w:rFonts w:ascii="Times New Roman" w:hAnsi="Times New Roman" w:cs="Times New Roman" w:eastAsia="Times New Roman"/>
+          <w:b w:val="0"/>
+          <w:i/>
+          <w:sz w:val="24"/>
+        </w:rPr>
+        <w:t>4. Hạ tầng Cloud: Máy chủ đặt tại Việt Nam — đáp ứng yêu cầu chủ quyền dữ liệu theo Điều 2.2.16.1.4 QCVN 12.</w:t>
+      </w:r>
+    </w:p>
+    <w:p>
+      <w:pPr>
+        <w:spacing w:before="40" w:after="40" w:lineRule="auto" w:line="276"/>
+        <w:ind w:firstLine="720"/>
+        <w:jc w:val="both"/>
+      </w:pPr>
+      <w:r>
+        <w:rPr>
+          <w:rFonts w:ascii="Times New Roman" w:hAnsi="Times New Roman" w:cs="Times New Roman" w:eastAsia="Times New Roman"/>
+          <w:b w:val="0"/>
+          <w:i w:val="0"/>
+          <w:sz w:val="26"/>
+        </w:rPr>
+        <w:t>&gt;</w:t>
+      </w:r>
+    </w:p>
+    <w:p>
+      <w:pPr>
+        <w:spacing w:before="40" w:after="40"/>
+        <w:ind w:left="720"/>
+        <w:jc w:val="both"/>
+      </w:pPr>
+      <w:r>
+        <w:rPr>
+          <w:rFonts w:ascii="Times New Roman" w:hAnsi="Times New Roman" w:cs="Times New Roman" w:eastAsia="Times New Roman"/>
+          <w:b w:val="0"/>
+          <w:i/>
+          <w:sz w:val="24"/>
+        </w:rPr>
+        <w:t>Phương án này đảm bảo tuân thủ đầy đủ pháp luật về BIM và an ninh mạng ngay khi các quy định có hiệu lực từ 01/07/2026.</w:t>
+      </w:r>
+    </w:p>
+    <w:p/>
+    <w:tbl>
+      <w:tblPr>
+        <w:tblW w:type="auto" w:w="0"/>
+        <w:tblLayout w:type="fixed"/>
+        <w:tblLook w:firstColumn="1" w:firstRow="1" w:lastColumn="0" w:lastRow="0" w:noHBand="0" w:noVBand="1" w:val="04A0"/>
+        <w:tblBorders>
+          <w:top w:val="none" w:sz="0"/>
+          <w:left w:val="none" w:sz="0"/>
+          <w:bottom w:val="none" w:sz="0"/>
+          <w:right w:val="none" w:sz="0"/>
+          <w:insideH w:val="none" w:sz="0"/>
+          <w:insideV w:val="none" w:sz="0"/>
+        </w:tblBorders>
+      </w:tblPr>
+      <w:tblGrid>
+        <w:gridCol w:w="4535"/>
+        <w:gridCol w:w="4819"/>
+      </w:tblGrid>
+      <w:tr>
+        <w:tc>
+          <w:tcPr>
+            <w:tcW w:type="dxa" w:w="4680"/>
+          </w:tcPr>
+          <w:p/>
+        </w:tc>
+        <w:tc>
+          <w:tcPr>
+            <w:tcW w:type="dxa" w:w="4680"/>
+          </w:tcPr>
+          <w:p>
+            <w:pPr>
+              <w:jc w:val="center"/>
+            </w:pPr>
+            <w:r>
+              <w:rPr>
+                <w:rFonts w:ascii="Times New Roman" w:hAnsi="Times New Roman" w:cs="Times New Roman" w:eastAsia="Times New Roman"/>
+                <w:b/>
+                <w:i w:val="0"/>
+                <w:sz w:val="23"/>
+              </w:rPr>
+              <w:t>CÔNG TY CỔ PHẦN CÔNG NGHỆ VÀ TƯ VẤN CIC</w:t>
+            </w:r>
+          </w:p>
+          <w:p>
+            <w:pPr>
+              <w:jc w:val="center"/>
+            </w:pPr>
+            <w:r>
+              <w:rPr>
+                <w:rFonts w:ascii="Times New Roman" w:hAnsi="Times New Roman" w:cs="Times New Roman" w:eastAsia="Times New Roman"/>
+                <w:b w:val="0"/>
+                <w:i/>
+                <w:sz w:val="23"/>
+              </w:rPr>
+              <w:t>(Ký tên, đóng dấu)</w:t>
+            </w:r>
+          </w:p>
+        </w:tc>
+      </w:tr>
+    </w:tbl>
     <w:sectPr>
       <w:pgSz w:w="12240" w:h="15840"/>
       <w:pgMar w:top="568" w:right="1440" w:bottom="1440" w:left="1440" w:header="720" w:footer="720" w:gutter="0"/>

</xml_diff>